<commit_message>
Some Comments from Love
</commit_message>
<xml_diff>
--- a/ResearchStatement_SSH.docx
+++ b/ResearchStatement_SSH.docx
@@ -16,7 +16,6 @@
         <w:t>esearch Statement</w:t>
       </w:r>
     </w:p>
-    <w:p/>
     <w:p>
       <w:pPr>
         <w:pStyle w:val="1"/>
@@ -30,613 +29,1547 @@
       <w:r>
         <w:t>urrent Objectives</w:t>
       </w:r>
-    </w:p>
-    <w:p>
-      <w:r>
-        <w:rPr>
-          <w:rFonts w:hint="eastAsia"/>
+      <w:r>
+        <w:t xml:space="preserve"> (Summary</w:t>
+      </w:r>
+      <w:r>
+        <w:rPr>
+          <w:rFonts w:hint="eastAsia"/>
+        </w:rPr>
+        <w:t>로 교체하는 방안</w:t>
+      </w:r>
+      <w:r>
+        <w:rPr>
+          <w:rFonts w:hint="eastAsia"/>
+        </w:rPr>
+        <w:t xml:space="preserve"> </w:t>
+      </w:r>
+      <w:r>
+        <w:t xml:space="preserve">or </w:t>
+      </w:r>
+      <w:r>
+        <w:rPr>
+          <w:rFonts w:hint="eastAsia"/>
+        </w:rPr>
+        <w:t>영역의 중요성/필요성</w:t>
+      </w:r>
+      <w:r>
+        <w:rPr>
+          <w:rFonts w:hint="eastAsia"/>
+        </w:rPr>
+        <w:t>)</w:t>
+      </w:r>
+    </w:p>
+    <w:p>
+      <w:pPr>
+        <w:rPr>
+          <w:rFonts w:hint="eastAsia"/>
+        </w:rPr>
+      </w:pPr>
+      <w:r>
+        <w:rPr>
+          <w:rFonts w:hint="eastAsia"/>
+        </w:rPr>
+        <w:t xml:space="preserve">내 연구는 기존의 혹은 개량된 </w:t>
+      </w:r>
+      <w:r>
+        <w:t>Newton’s method</w:t>
+      </w:r>
+      <w:r>
+        <w:rPr>
+          <w:rFonts w:hint="eastAsia"/>
+        </w:rPr>
+        <w:t xml:space="preserve">를 이용하여 </w:t>
+      </w:r>
+      <w:r>
+        <w:t>nonlinear matrix equation</w:t>
+      </w:r>
+      <w:r>
+        <w:rPr>
+          <w:rFonts w:hint="eastAsia"/>
+        </w:rPr>
+        <w:t xml:space="preserve">의 </w:t>
+      </w:r>
+      <w:r>
+        <w:t>solution</w:t>
+      </w:r>
+      <w:r>
+        <w:rPr>
+          <w:rFonts w:hint="eastAsia"/>
+        </w:rPr>
+        <w:t>을 찾는 것이다.</w:t>
+      </w:r>
+      <w:r>
+        <w:t xml:space="preserve"> </w:t>
+      </w:r>
+      <w:r>
+        <w:rPr>
+          <w:rFonts w:hint="eastAsia"/>
+        </w:rPr>
+        <w:t>이 연구</w:t>
+      </w:r>
+      <w:r>
+        <w:rPr>
+          <w:rFonts w:hint="eastAsia"/>
+        </w:rPr>
+        <w:t>는</w:t>
+      </w:r>
+      <w:r>
+        <w:rPr>
+          <w:rFonts w:hint="eastAsia"/>
+        </w:rPr>
+        <w:t>,</w:t>
+      </w:r>
+      <w:r>
+        <w:t xml:space="preserve"> </w:t>
+      </w:r>
+      <w:r>
+        <w:rPr>
+          <w:rFonts w:hint="eastAsia"/>
+        </w:rPr>
+        <w:t xml:space="preserve">여러 </w:t>
+      </w:r>
+      <w:r>
+        <w:t>queueing model</w:t>
+      </w:r>
+      <w:r>
+        <w:rPr>
+          <w:rFonts w:hint="eastAsia"/>
+        </w:rPr>
+        <w:t xml:space="preserve">에서 </w:t>
+      </w:r>
+      <w:r>
+        <w:t>stationary vector</w:t>
+      </w:r>
+      <w:r>
+        <w:rPr>
+          <w:rFonts w:hint="eastAsia"/>
+        </w:rPr>
+        <w:t>를 구하거나,</w:t>
+      </w:r>
+      <w:r>
+        <w:t xml:space="preserve"> </w:t>
+      </w:r>
+      <w:r>
+        <w:t>generalized eigenvalue problem (like quadratic eigenvalue problem)</w:t>
+      </w:r>
+      <w:r>
+        <w:rPr>
+          <w:rFonts w:hint="eastAsia"/>
+        </w:rPr>
+        <w:t>을 쉽게 해결하는 데에 활용될 수 있다.</w:t>
+      </w:r>
+    </w:p>
+    <w:p>
+      <w:pPr>
+        <w:pStyle w:val="4"/>
+        <w:rPr>
+          <w:rFonts w:hint="eastAsia"/>
+          <w:color w:val="FF0000"/>
+        </w:rPr>
+      </w:pPr>
+      <w:r>
+        <w:rPr>
+          <w:rFonts w:hint="eastAsia"/>
+          <w:color w:val="FF0000"/>
+        </w:rPr>
+        <w:t>부가설명</w:t>
+      </w:r>
+    </w:p>
+    <w:p>
+      <w:pPr>
+        <w:rPr>
+          <w:color w:val="FF0000"/>
+        </w:rPr>
+      </w:pPr>
+      <w:r>
+        <w:rPr>
+          <w:rFonts w:hint="eastAsia"/>
+          <w:color w:val="FF0000"/>
         </w:rPr>
         <w:t>첫</w:t>
       </w:r>
       <w:r>
-        <w:t xml:space="preserve"> 문단은 자신의 대략적인 연구 내용(research interest)에 대해 한 문장으로 요약하고 이어지는 문장에서 본인의 궁극적인 연구 목적(research objectives)을 서술합니다. </w:t>
-      </w:r>
-    </w:p>
-    <w:p/>
-    <w:p>
-      <w:r>
-        <w:rPr>
-          <w:rFonts w:hint="eastAsia"/>
+        <w:rPr>
+          <w:color w:val="FF0000"/>
+        </w:rPr>
+        <w:t xml:space="preserve"> 문단은</w:t>
+      </w:r>
+      <w:r>
+        <w:rPr>
+          <w:color w:val="FF0000"/>
+        </w:rPr>
+        <w:t xml:space="preserve"> 자신의 대략적인 연구 내용(research interest)에 대해 한 문장으로 요약하고 이어지는 문장에서 본인의 궁극적인 연구 목적(research objectives)을 서술합니다. </w:t>
+      </w:r>
+    </w:p>
+    <w:p>
+      <w:pPr>
+        <w:rPr>
+          <w:color w:val="FF0000"/>
+        </w:rPr>
+      </w:pPr>
+      <w:r>
+        <w:rPr>
+          <w:rFonts w:hint="eastAsia"/>
+          <w:color w:val="FF0000"/>
         </w:rPr>
         <w:t>이후에</w:t>
       </w:r>
       <w:r>
+        <w:rPr>
+          <w:color w:val="FF0000"/>
+        </w:rPr>
         <w:t xml:space="preserve"> 연구 주제, 경험에 대해 자세히 서술할 예정이기 때문에 연구 주제들을 자세히 적기보다는 연구 동기나 목적을 부각할 수 있도록 작성합니다. </w:t>
       </w:r>
     </w:p>
-    <w:p/>
-    <w:p>
-      <w:r>
-        <w:rPr>
-          <w:rFonts w:hint="eastAsia"/>
+    <w:p>
+      <w:pPr>
+        <w:rPr>
+          <w:color w:val="FF0000"/>
+        </w:rPr>
+      </w:pPr>
+      <w:r>
+        <w:rPr>
+          <w:rFonts w:hint="eastAsia"/>
+          <w:color w:val="FF0000"/>
         </w:rPr>
         <w:t>원래</w:t>
       </w:r>
       <w:r>
+        <w:rPr>
+          <w:color w:val="FF0000"/>
+        </w:rPr>
         <w:t xml:space="preserve"> 가지고 있었던 연구 목적도 좋지만 지원하는 기관과 방향이 같도록 연구 목적을 작성해도 좋을 것 같습니다. 또는 과거, 현재, 미래의 연구 주제들에 대해 요약(summary) 하는 문단을 작성해도 좋습니다.</w:t>
       </w:r>
     </w:p>
-    <w:p/>
-    <w:p>
-      <w:r>
-        <w:rPr>
-          <w:rFonts w:hint="eastAsia"/>
+    <w:p>
+      <w:pPr>
+        <w:rPr>
+          <w:color w:val="FF0000"/>
+        </w:rPr>
+      </w:pPr>
+    </w:p>
+    <w:p>
+      <w:pPr>
+        <w:rPr>
+          <w:color w:val="FF0000"/>
+        </w:rPr>
+      </w:pPr>
+      <w:r>
+        <w:rPr>
+          <w:rFonts w:hint="eastAsia"/>
+          <w:color w:val="FF0000"/>
         </w:rPr>
         <w:t>●예시</w:t>
       </w:r>
       <w:r>
+        <w:rPr>
+          <w:color w:val="FF0000"/>
+        </w:rPr>
         <w:t xml:space="preserve">: My research interests are ~. My research is following objectives: Development of ~ for ~. </w:t>
       </w:r>
     </w:p>
-    <w:p/>
-    <w:p>
-      <w:r>
-        <w:rPr>
-          <w:rFonts w:hint="eastAsia"/>
+    <w:p>
+      <w:pPr>
+        <w:rPr>
+          <w:color w:val="FF0000"/>
+        </w:rPr>
+      </w:pPr>
+      <w:r>
+        <w:rPr>
+          <w:rFonts w:hint="eastAsia"/>
+          <w:color w:val="FF0000"/>
         </w:rPr>
         <w:t>●예시</w:t>
       </w:r>
       <w:r>
+        <w:rPr>
+          <w:color w:val="FF0000"/>
+        </w:rPr>
         <w:t>: I am interested in understanding ~ by ~. In my research, under the guidance of 사람 이름, I have designed and implemented problem solving systems that demonstrate ~. I have built a program that makes ~. I have developed a cognitive theory of how people acquire ~. The next sections describe my work, and then I talk about future research directions.</w:t>
       </w:r>
     </w:p>
-    <w:p/>
-    <w:p>
-      <w:r>
-        <w:rPr>
-          <w:rFonts w:hint="eastAsia"/>
+    <w:p>
+      <w:pPr>
+        <w:rPr>
+          <w:color w:val="FF0000"/>
+        </w:rPr>
+      </w:pPr>
+      <w:r>
+        <w:rPr>
+          <w:rFonts w:hint="eastAsia"/>
+          <w:color w:val="FF0000"/>
         </w:rPr>
         <w:t>●예시</w:t>
       </w:r>
       <w:r>
-        <w:t xml:space="preserve">: My research is guided by questions: What are the sources of ~? What types of </w:t>
-      </w:r>
-      <w:proofErr w:type="gramStart"/>
-      <w:r>
-        <w:t>pathway</w:t>
-      </w:r>
-      <w:proofErr w:type="gramEnd"/>
-      <w:r>
-        <w:t xml:space="preserve"> ~? How do climate change ~? How can we ~?</w:t>
-      </w:r>
-    </w:p>
-    <w:p/>
-    <w:p>
+        <w:rPr>
+          <w:color w:val="FF0000"/>
+        </w:rPr>
+        <w:t>: My research is guided by questions: What are the sources of ~? What types of pathway ~? How do climate change ~? How can we ~?</w:t>
+      </w:r>
+    </w:p>
+    <w:p>
+      <w:pPr>
+        <w:rPr>
+          <w:color w:val="FF0000"/>
+        </w:rPr>
+      </w:pPr>
+      <w:r>
+        <w:rPr>
+          <w:rFonts w:hint="eastAsia"/>
+          <w:color w:val="FF0000"/>
+        </w:rPr>
+        <w:t>●예시</w:t>
+      </w:r>
+      <w:r>
+        <w:rPr>
+          <w:color w:val="FF0000"/>
+        </w:rPr>
+        <w:t>: My research interests are in three major areas: sustainable manufacturing, ~manufacturing, ~manufacturing. I have been inspired to explore them further with my background expertise in design, manufacturing and mechanics. Specific topics are summarized below:</w:t>
+      </w:r>
+    </w:p>
+    <w:p>
+      <w:pPr>
+        <w:rPr>
+          <w:color w:val="FF0000"/>
+        </w:rPr>
+      </w:pPr>
+      <w:r>
+        <w:rPr>
+          <w:rFonts w:hint="eastAsia"/>
+          <w:color w:val="FF0000"/>
+        </w:rPr>
+        <w:t>●예시</w:t>
+      </w:r>
+      <w:r>
+        <w:rPr>
+          <w:color w:val="FF0000"/>
+        </w:rPr>
+        <w:t>: My research goal is to create new knowledge and make a positive impact in the industry and ~. Detailed information for each aforementioned area, including the motivation, is given in the following subsections;</w:t>
+      </w:r>
+    </w:p>
+    <w:p>
+      <w:pPr>
+        <w:rPr>
+          <w:color w:val="FF0000"/>
+        </w:rPr>
+      </w:pPr>
+      <w:r>
+        <w:rPr>
+          <w:rFonts w:hint="eastAsia"/>
+          <w:color w:val="FF0000"/>
+        </w:rPr>
+        <w:t>●예시</w:t>
+      </w:r>
+      <w:r>
+        <w:rPr>
+          <w:color w:val="FF0000"/>
+        </w:rPr>
+        <w:t>: My research focus in ~. This work encompasses improving ~. I believe that this direction is the key to enabling new levels of performance, efficiency, and ~.</w:t>
+      </w:r>
+    </w:p>
+    <w:p>
+      <w:pPr>
+        <w:rPr>
+          <w:color w:val="FF0000"/>
+        </w:rPr>
+      </w:pPr>
+      <w:r>
+        <w:rPr>
+          <w:rFonts w:hint="eastAsia"/>
+          <w:color w:val="FF0000"/>
+        </w:rPr>
+        <w:t>●예시</w:t>
+      </w:r>
+      <w:r>
+        <w:rPr>
+          <w:color w:val="FF0000"/>
+        </w:rPr>
+        <w:t xml:space="preserve">: Early in my research career, I worked on ~. In my future research, I will develop new ~. </w:t>
+      </w:r>
+    </w:p>
+    <w:p>
+      <w:pPr>
+        <w:rPr>
+          <w:color w:val="FF0000"/>
+        </w:rPr>
+      </w:pPr>
+      <w:r>
+        <w:rPr>
+          <w:rFonts w:hint="eastAsia"/>
+          <w:color w:val="FF0000"/>
+        </w:rPr>
+        <w:t>●예시</w:t>
+      </w:r>
+      <w:r>
+        <w:rPr>
+          <w:color w:val="FF0000"/>
+        </w:rPr>
+        <w:t>: My career goal is to make ~.</w:t>
+      </w:r>
+    </w:p>
+    <w:p>
+      <w:pPr>
+        <w:rPr>
+          <w:color w:val="FF0000"/>
+        </w:rPr>
+      </w:pPr>
+      <w:r>
+        <w:rPr>
+          <w:rFonts w:hint="eastAsia"/>
+          <w:color w:val="FF0000"/>
+        </w:rPr>
+        <w:t>●예시</w:t>
+      </w:r>
+      <w:r>
+        <w:rPr>
+          <w:color w:val="FF0000"/>
+        </w:rPr>
+        <w:t>: My mission is to become a world leader on systems and control tools for ~.</w:t>
+      </w:r>
+    </w:p>
+    <w:p>
+      <w:pPr>
+        <w:rPr>
+          <w:color w:val="FF0000"/>
+        </w:rPr>
+      </w:pPr>
+    </w:p>
+    <w:p>
+      <w:pPr>
+        <w:rPr>
+          <w:color w:val="FF0000"/>
+        </w:rPr>
+      </w:pPr>
+      <w:r>
+        <w:rPr>
+          <w:color w:val="FF0000"/>
+        </w:rPr>
+        <w:t>​추가로 이러한 목적을 이루기 위해 자신이 가진 기술, 노력한 점을 간단히 서술합니다.</w:t>
+      </w:r>
+    </w:p>
+    <w:p>
+      <w:pPr>
+        <w:rPr>
+          <w:color w:val="FF0000"/>
+        </w:rPr>
+      </w:pPr>
+      <w:r>
+        <w:rPr>
+          <w:color w:val="FF0000"/>
+        </w:rPr>
+        <w:t>​</w:t>
+      </w:r>
+    </w:p>
+    <w:p>
+      <w:pPr>
+        <w:rPr>
+          <w:color w:val="FF0000"/>
+        </w:rPr>
+      </w:pPr>
+      <w:r>
+        <w:rPr>
+          <w:rFonts w:hint="eastAsia"/>
+          <w:color w:val="FF0000"/>
+        </w:rPr>
+        <w:t>●예시</w:t>
+      </w:r>
+      <w:r>
+        <w:rPr>
+          <w:color w:val="FF0000"/>
+        </w:rPr>
+        <w:t xml:space="preserve"> 문장: For these objectives, ~ has been my research principle. With the skilled ~ techniques, I explore both ~ and ~. As an ~ engineer (or scientist), I view the area of ~ that will solve the ~ problems. </w:t>
+      </w:r>
+    </w:p>
+    <w:p>
+      <w:pPr>
+        <w:rPr>
+          <w:color w:val="FF0000"/>
+        </w:rPr>
+      </w:pPr>
+      <w:r>
+        <w:rPr>
+          <w:rFonts w:hint="eastAsia"/>
+          <w:color w:val="FF0000"/>
+        </w:rPr>
+        <w:t>●예시</w:t>
+      </w:r>
+      <w:r>
+        <w:rPr>
+          <w:color w:val="FF0000"/>
+        </w:rPr>
+        <w:t>: To address these questions, my research utilizes ~ to characterize ~ systems.</w:t>
+      </w:r>
+    </w:p>
+    <w:p>
+      <w:pPr>
+        <w:rPr>
+          <w:color w:val="FF0000"/>
+        </w:rPr>
+      </w:pPr>
+      <w:r>
+        <w:rPr>
+          <w:rFonts w:hint="eastAsia"/>
+          <w:color w:val="FF0000"/>
+        </w:rPr>
+        <w:t>●예시</w:t>
+      </w:r>
+      <w:r>
+        <w:rPr>
+          <w:color w:val="FF0000"/>
+        </w:rPr>
+        <w:t>: I have carefully prepared myself to achieve the aforementioned goals in the following ways:</w:t>
+      </w:r>
+    </w:p>
+    <w:p>
+      <w:r>
+        <w:rPr>
+          <w:rFonts w:hint="eastAsia"/>
+          <w:color w:val="FF0000"/>
+        </w:rPr>
+        <w:t>●예시</w:t>
+      </w:r>
+      <w:r>
+        <w:rPr>
+          <w:color w:val="FF0000"/>
+        </w:rPr>
+        <w:t>: My leadership skills, accomplishments, expertise, and interests provide a strong foundation to achieve this goal.</w:t>
+      </w:r>
+    </w:p>
+    <w:p>
+      <w:pPr>
+        <w:pStyle w:val="1"/>
+      </w:pPr>
+      <w:r>
+        <w:rPr>
+          <w:rFonts w:hint="eastAsia"/>
+        </w:rPr>
+        <w:t>P</w:t>
+      </w:r>
+      <w:r>
+        <w:t>ast Research</w:t>
+      </w:r>
+      <w:r>
+        <w:t xml:space="preserve"> </w:t>
+      </w:r>
+      <w:r>
+        <w:rPr>
+          <w:rFonts w:hint="eastAsia"/>
+        </w:rPr>
+        <w:t>(C</w:t>
+      </w:r>
+      <w:r>
+        <w:t>urrent</w:t>
+      </w:r>
+      <w:r>
+        <w:rPr>
+          <w:rFonts w:hint="eastAsia"/>
+        </w:rPr>
+        <w:t>의 부가 설명적 요소로?)</w:t>
+      </w:r>
+    </w:p>
+    <w:p>
+      <w:pPr>
+        <w:pStyle w:val="3"/>
+      </w:pPr>
+      <w:r>
+        <w:rPr>
+          <w:rFonts w:hint="eastAsia"/>
+        </w:rPr>
+        <w:t>I</w:t>
+      </w:r>
+      <w:r>
+        <w:t>terative Method solving nonlinear matrix equations</w:t>
+      </w:r>
+    </w:p>
+    <w:p>
+      <w:r>
+        <w:rPr>
+          <w:rFonts w:hint="eastAsia"/>
+        </w:rPr>
+        <w:t xml:space="preserve">여러가지 </w:t>
+      </w:r>
+      <w:r>
+        <w:t>nonlinear matrix equation</w:t>
+      </w:r>
+      <w:r>
+        <w:rPr>
+          <w:rFonts w:hint="eastAsia"/>
+        </w:rPr>
+        <w:t>(</w:t>
+      </w:r>
+      <w:r>
+        <w:t>quadratic matrix equation, matrix polynomial equation, order-convex matrix equation</w:t>
+      </w:r>
+      <w:r>
+        <w:rPr>
+          <w:rFonts w:hint="eastAsia"/>
+        </w:rPr>
+        <w:t>)</w:t>
+      </w:r>
+      <w:r>
+        <w:rPr>
+          <w:rFonts w:hint="eastAsia"/>
+        </w:rPr>
+        <w:t xml:space="preserve">의 특정 </w:t>
+      </w:r>
+      <w:r>
+        <w:t>solution</w:t>
+      </w:r>
+      <w:r>
+        <w:rPr>
+          <w:rFonts w:hint="eastAsia"/>
+        </w:rPr>
+        <w:t xml:space="preserve">을 </w:t>
+      </w:r>
+      <w:r>
+        <w:t>Newton’s method</w:t>
+      </w:r>
+      <w:r>
+        <w:rPr>
+          <w:rFonts w:hint="eastAsia"/>
+        </w:rPr>
+        <w:t xml:space="preserve">를 이용하여 찾는 방법을 </w:t>
+      </w:r>
+      <w:r>
+        <w:t>analysis</w:t>
+      </w:r>
+      <w:r>
+        <w:rPr>
+          <w:rFonts w:hint="eastAsia"/>
+        </w:rPr>
+        <w:t xml:space="preserve">하고 </w:t>
+      </w:r>
+      <w:r>
+        <w:t>Newton’s method</w:t>
+      </w:r>
+      <w:r>
+        <w:rPr>
+          <w:rFonts w:hint="eastAsia"/>
+        </w:rPr>
+        <w:t xml:space="preserve">를 </w:t>
+      </w:r>
+      <w:r>
+        <w:t>modify</w:t>
+      </w:r>
+      <w:r>
+        <w:rPr>
+          <w:rFonts w:hint="eastAsia"/>
+        </w:rPr>
+        <w:t xml:space="preserve">하여 기존 </w:t>
+      </w:r>
+      <w:r>
+        <w:t>Newton’s method</w:t>
+      </w:r>
+      <w:r>
+        <w:rPr>
+          <w:rFonts w:hint="eastAsia"/>
+        </w:rPr>
+        <w:t xml:space="preserve">보다 더 빠르게 </w:t>
+      </w:r>
+      <w:r>
+        <w:t>solution</w:t>
+      </w:r>
+      <w:r>
+        <w:rPr>
+          <w:rFonts w:hint="eastAsia"/>
+        </w:rPr>
+        <w:t>을 찾는 방법을 연구</w:t>
+      </w:r>
+    </w:p>
+    <w:p>
+      <w:pPr>
+        <w:pStyle w:val="3"/>
+        <w:rPr>
+          <w:rFonts w:hint="eastAsia"/>
+        </w:rPr>
+      </w:pPr>
+      <w:r>
+        <w:t xml:space="preserve">Medical </w:t>
+      </w:r>
+      <w:r>
+        <w:rPr>
+          <w:rFonts w:hint="eastAsia"/>
+        </w:rPr>
+        <w:t>I</w:t>
+      </w:r>
+      <w:r>
+        <w:t>mage Processing with Neural Network Models</w:t>
+      </w:r>
+    </w:p>
+    <w:p>
+      <w:pPr>
+        <w:rPr>
+          <w:rFonts w:hint="eastAsia"/>
+        </w:rPr>
+      </w:pPr>
+      <w:r>
+        <w:rPr>
+          <w:rFonts w:hint="eastAsia"/>
+        </w:rPr>
+        <w:t xml:space="preserve">이미지 프로세싱 </w:t>
+      </w:r>
+      <w:r>
+        <w:t>neural network</w:t>
+      </w:r>
+      <w:r>
+        <w:t xml:space="preserve"> model</w:t>
+      </w:r>
+      <w:r>
+        <w:rPr>
+          <w:rFonts w:hint="eastAsia"/>
+        </w:rPr>
+        <w:t>을</w:t>
+      </w:r>
+      <w:r>
+        <w:rPr>
+          <w:rFonts w:hint="eastAsia"/>
+        </w:rPr>
+        <w:t xml:space="preserve"> 이용</w:t>
+      </w:r>
+      <w:r>
+        <w:rPr>
+          <w:rFonts w:hint="eastAsia"/>
+        </w:rPr>
+        <w:t>하여</w:t>
+      </w:r>
+      <w:r>
+        <w:rPr>
+          <w:rFonts w:hint="eastAsia"/>
+        </w:rPr>
+        <w:t>,</w:t>
+      </w:r>
+      <w:r>
+        <w:t xml:space="preserve"> </w:t>
+      </w:r>
+      <w:r>
+        <w:rPr>
+          <w:rFonts w:hint="eastAsia"/>
+        </w:rPr>
+        <w:t>안저사진 기반 안과질환 판독 알고리즘 개발 프로젝트 참여,</w:t>
+      </w:r>
+      <w:r>
+        <w:t xml:space="preserve"> </w:t>
+      </w:r>
+      <w:r>
+        <w:rPr>
+          <w:rFonts w:hint="eastAsia"/>
+        </w:rPr>
+        <w:t xml:space="preserve">스마트폰 촬영 치아 사진 기반 </w:t>
+      </w:r>
+      <w:r>
+        <w:rPr>
+          <w:rFonts w:hint="eastAsia"/>
+        </w:rPr>
+        <w:t xml:space="preserve">치아번호 </w:t>
+      </w:r>
+      <w:r>
+        <w:t xml:space="preserve">segmentation </w:t>
+      </w:r>
+      <w:r>
+        <w:rPr>
+          <w:rFonts w:hint="eastAsia"/>
+        </w:rPr>
+        <w:t>알고리즘 개발 참여</w:t>
+      </w:r>
+      <w:r>
+        <w:rPr>
+          <w:rFonts w:hint="eastAsia"/>
+        </w:rPr>
+        <w:t xml:space="preserve"> 등을 수행하였다.</w:t>
+      </w:r>
+    </w:p>
+    <w:p>
+      <w:pPr>
+        <w:pStyle w:val="4"/>
+        <w:rPr>
+          <w:color w:val="FF0000"/>
+        </w:rPr>
+      </w:pPr>
+      <w:r>
+        <w:rPr>
+          <w:rFonts w:hint="eastAsia"/>
+          <w:color w:val="FF0000"/>
+        </w:rPr>
+        <w:t>부가설명</w:t>
+      </w:r>
+    </w:p>
+    <w:p>
+      <w:pPr>
+        <w:rPr>
+          <w:color w:val="FF0000"/>
+        </w:rPr>
+      </w:pPr>
+      <w:r>
+        <w:rPr>
+          <w:rFonts w:hint="eastAsia"/>
+          <w:color w:val="FF0000"/>
+        </w:rPr>
+        <w:t>다음</w:t>
+      </w:r>
+      <w:r>
+        <w:rPr>
+          <w:color w:val="FF0000"/>
+        </w:rPr>
+        <w:t xml:space="preserve"> 항목에는 학위 기간 또는 지난 연구 경력 동안 완료한 연구들을 주제별로 나누어 자세히 서술하는 항목입니다.</w:t>
+      </w:r>
+    </w:p>
+    <w:p>
+      <w:pPr>
+        <w:rPr>
+          <w:color w:val="FF0000"/>
+        </w:rPr>
+      </w:pPr>
+      <w:r>
+        <w:rPr>
+          <w:rFonts w:hint="eastAsia"/>
+          <w:color w:val="FF0000"/>
+        </w:rPr>
+        <w:t>주제별로</w:t>
+      </w:r>
+      <w:r>
+        <w:rPr>
+          <w:color w:val="FF0000"/>
+        </w:rPr>
+        <w:t xml:space="preserve"> 설명하기 전, 자신이 연구한 내용 중에 가장 노블한 포인트를 설명해 주거나 이 연구들이 왜 필요한 지 설명합니다.</w:t>
+      </w:r>
+    </w:p>
+    <w:p>
+      <w:pPr>
+        <w:rPr>
+          <w:color w:val="FF0000"/>
+        </w:rPr>
+      </w:pPr>
+      <w:r>
+        <w:rPr>
+          <w:rFonts w:hint="eastAsia"/>
+          <w:color w:val="FF0000"/>
+        </w:rPr>
+        <w:t>또는</w:t>
+      </w:r>
+      <w:r>
+        <w:rPr>
+          <w:color w:val="FF0000"/>
+        </w:rPr>
+        <w:t>, 각 연구 주제를 이해하는 데 필요한 기본 지식, 용어를 논문의 introduction처럼 먼저 대략 설명해 주어도 좋습니다.</w:t>
+      </w:r>
+    </w:p>
+    <w:p>
+      <w:pPr>
+        <w:rPr>
+          <w:color w:val="FF0000"/>
+        </w:rPr>
+      </w:pPr>
+      <w:r>
+        <w:rPr>
+          <w:rFonts w:hint="eastAsia"/>
+          <w:color w:val="FF0000"/>
+        </w:rPr>
+        <w:t>●예시</w:t>
+      </w:r>
+      <w:r>
+        <w:rPr>
+          <w:color w:val="FF0000"/>
+        </w:rPr>
+        <w:t>: The most notable finding of my Ph.D. research was the development of ~ for ~.</w:t>
+      </w:r>
+    </w:p>
+    <w:p>
+      <w:pPr>
+        <w:rPr>
+          <w:color w:val="FF0000"/>
+        </w:rPr>
+      </w:pPr>
+      <w:r>
+        <w:rPr>
+          <w:rFonts w:hint="eastAsia"/>
+          <w:color w:val="FF0000"/>
+        </w:rPr>
+        <w:t>●예시</w:t>
+      </w:r>
+      <w:r>
+        <w:rPr>
+          <w:color w:val="FF0000"/>
+        </w:rPr>
+        <w:t>: Therefore, the magnitude of the problem necessitates the research for ~ materials to replace ~.</w:t>
+      </w:r>
+    </w:p>
+    <w:p>
+      <w:pPr>
+        <w:rPr>
+          <w:color w:val="FF0000"/>
+        </w:rPr>
+      </w:pPr>
+      <w:r>
+        <w:rPr>
+          <w:color w:val="FF0000"/>
+        </w:rPr>
+        <w:t>​추가적으로 연구 주제의 대략적인 제목을 서술하고 한~두 문단으로 연구 요약 내용을 서술합니다.</w:t>
+      </w:r>
+    </w:p>
+    <w:p>
+      <w:pPr>
+        <w:rPr>
+          <w:color w:val="FF0000"/>
+        </w:rPr>
+      </w:pPr>
+      <w:r>
+        <w:rPr>
+          <w:rFonts w:hint="eastAsia"/>
+          <w:color w:val="FF0000"/>
+        </w:rPr>
+        <w:t>연구</w:t>
+      </w:r>
+      <w:r>
+        <w:rPr>
+          <w:color w:val="FF0000"/>
+        </w:rPr>
+        <w:t xml:space="preserve"> 주제의 제목은 논문 제목을 그대로 사용하기보다는 Development of  ~, Comparative Study of ~처럼 명사로 설정하는 것이 좋습니다. 취향에 따라 항목으로 설정하지 않고 한 문단에 지난 연구를 모두 포함해서 서술해도 됩니다.</w:t>
+      </w:r>
+    </w:p>
+    <w:p>
+      <w:pPr>
+        <w:rPr>
+          <w:color w:val="FF0000"/>
+        </w:rPr>
+      </w:pPr>
+      <w:r>
+        <w:rPr>
+          <w:rFonts w:hint="eastAsia"/>
+          <w:color w:val="FF0000"/>
+        </w:rPr>
+        <w:t>●예시</w:t>
+      </w:r>
+      <w:r>
+        <w:rPr>
+          <w:color w:val="FF0000"/>
+        </w:rPr>
+        <w:t>: Comparative Study of Peroxide Oxidants Activated by nZVI</w:t>
+      </w:r>
+    </w:p>
+    <w:p>
+      <w:r>
+        <w:rPr>
+          <w:color w:val="FF0000"/>
+        </w:rPr>
+        <w:t>Combining oxidant and ZVI is possible to utilize adsorption and coprecipitation reactions as well as oxidation. The performance of nano-sized ZVI (nZVI) in the presence of the common oxidants (persulfate, peroxymonosulfate and hydrogen peroxide) was tested toward organic/inorganic contaminants, 1,4-dioxane and As(III). The persulfate showed the highest removal toward 1,4-Dixane and As(III), followed by hydrogen peroxide and peroxymonosulfate in order. This study provided a possible application of oxidant/ZVI systems for complex contaminated sites.</w:t>
+      </w:r>
+    </w:p>
+    <w:p>
+      <w:pPr>
+        <w:pStyle w:val="1"/>
+      </w:pPr>
+      <w:r>
+        <w:rPr>
+          <w:rFonts w:hint="eastAsia"/>
+        </w:rPr>
+        <w:t>C</w:t>
+      </w:r>
+      <w:r>
+        <w:t>urrent Research</w:t>
+      </w:r>
+      <w:r>
+        <w:t xml:space="preserve"> (</w:t>
+      </w:r>
+      <w:r>
+        <w:rPr>
+          <w:rFonts w:hint="eastAsia"/>
+        </w:rPr>
+        <w:t>연구의 방향성)</w:t>
+      </w:r>
+    </w:p>
+    <w:p>
+      <w:r>
+        <w:rPr>
+          <w:rFonts w:hint="eastAsia"/>
+        </w:rPr>
+        <w:t>M</w:t>
+      </w:r>
+      <w:r>
+        <w:t>atrix polynomial equation</w:t>
+      </w:r>
+      <w:r>
+        <w:rPr>
+          <w:rFonts w:hint="eastAsia"/>
+        </w:rPr>
+        <w:t xml:space="preserve">의 변형을 통한 </w:t>
+      </w:r>
+      <w:r>
+        <w:t>finding solution with Newton’s method</w:t>
+      </w:r>
+      <w:r>
+        <w:rPr>
+          <w:rFonts w:hint="eastAsia"/>
+        </w:rPr>
+        <w:t xml:space="preserve">의 </w:t>
+      </w:r>
+      <w:r>
+        <w:t>acceleration</w:t>
+      </w:r>
+    </w:p>
+    <w:p>
+      <w:r>
+        <w:rPr>
+          <w:rFonts w:hint="eastAsia"/>
+        </w:rPr>
+        <w:t>폐C</w:t>
+      </w:r>
+      <w:r>
+        <w:t xml:space="preserve">T </w:t>
+      </w:r>
+      <w:r>
+        <w:rPr>
+          <w:rFonts w:hint="eastAsia"/>
+        </w:rPr>
+        <w:t>기반 외상환자 정상 폐용적 탐색 알고리즘</w:t>
+      </w:r>
+    </w:p>
+    <w:p>
+      <w:pPr>
+        <w:rPr>
+          <w:rFonts w:hint="eastAsia"/>
+        </w:rPr>
+      </w:pPr>
+      <w:r>
+        <w:rPr>
+          <w:rFonts w:hint="eastAsia"/>
+        </w:rPr>
+        <w:t xml:space="preserve">연령대별 </w:t>
+      </w:r>
+      <w:r>
+        <w:t xml:space="preserve">contact matrix </w:t>
+      </w:r>
+      <w:r>
+        <w:rPr>
+          <w:rFonts w:hint="eastAsia"/>
+        </w:rPr>
+        <w:t xml:space="preserve">기반 국내 </w:t>
+      </w:r>
+      <w:r>
+        <w:t>COVID-19</w:t>
+      </w:r>
+      <w:r>
+        <w:rPr>
+          <w:rFonts w:hint="eastAsia"/>
+        </w:rPr>
+        <w:t>의 확산 예측과 정책 제안 연구</w:t>
+      </w:r>
+    </w:p>
+    <w:p>
+      <w:pPr>
+        <w:pStyle w:val="4"/>
+        <w:rPr>
+          <w:rFonts w:hint="eastAsia"/>
+          <w:color w:val="FF0000"/>
+        </w:rPr>
+      </w:pPr>
+      <w:r>
+        <w:rPr>
+          <w:rFonts w:hint="eastAsia"/>
+          <w:color w:val="FF0000"/>
+        </w:rPr>
+        <w:t>부가설명</w:t>
+      </w:r>
+    </w:p>
+    <w:p>
+      <w:pPr>
+        <w:rPr>
+          <w:color w:val="FF0000"/>
+        </w:rPr>
+      </w:pPr>
+      <w:r>
+        <w:rPr>
+          <w:color w:val="FF0000"/>
+        </w:rPr>
+        <w:t>Past research와 거의 비슷하지만 아직 논문으로 출간되지 않은 현재 진행 중인 연구에 대해 서술합니다.</w:t>
+      </w:r>
+    </w:p>
+    <w:p>
+      <w:pPr>
+        <w:rPr>
+          <w:color w:val="FF0000"/>
+        </w:rPr>
+      </w:pPr>
+      <w:r>
+        <w:rPr>
+          <w:rFonts w:hint="eastAsia"/>
+          <w:color w:val="FF0000"/>
+        </w:rPr>
+        <w:t>학위</w:t>
+      </w:r>
+      <w:r>
+        <w:rPr>
+          <w:color w:val="FF0000"/>
+        </w:rPr>
+        <w:t xml:space="preserve"> 받은 곳이 아닌 다른 곳에서 일하고 있다면 현재 일하는 곳에서 수행하는 과제나 연구 내용을 서술하면 되겠죠.</w:t>
+      </w:r>
+    </w:p>
+    <w:p>
+      <w:pPr>
+        <w:rPr>
+          <w:color w:val="FF0000"/>
+        </w:rPr>
+      </w:pPr>
+      <w:r>
+        <w:rPr>
+          <w:rFonts w:hint="eastAsia"/>
+          <w:color w:val="FF0000"/>
+        </w:rPr>
+        <w:t>과거에</w:t>
+      </w:r>
+      <w:r>
+        <w:rPr>
+          <w:color w:val="FF0000"/>
+        </w:rPr>
+        <w:t xml:space="preserve"> 수행했던 연구보다 주제 개수는 적을지라도 연구 목적, 결과에 대해 더 자세히 서술하시는 것을 추천합니다.</w:t>
+      </w:r>
+    </w:p>
+    <w:p>
+      <w:pPr>
+        <w:rPr>
+          <w:color w:val="FF0000"/>
+        </w:rPr>
+      </w:pPr>
+      <w:r>
+        <w:rPr>
+          <w:rFonts w:hint="eastAsia"/>
+          <w:color w:val="FF0000"/>
+        </w:rPr>
+        <w:t>연구</w:t>
+      </w:r>
+      <w:r>
+        <w:rPr>
+          <w:color w:val="FF0000"/>
+        </w:rPr>
+        <w:t xml:space="preserve"> 목표에서 서술했을 수도 있지만 자신의 연구 스타일에 대해서도 언급할 수 있습니다.</w:t>
+      </w:r>
+    </w:p>
+    <w:p>
+      <w:pPr>
+        <w:rPr>
+          <w:color w:val="FF0000"/>
+        </w:rPr>
+      </w:pPr>
+      <w:r>
+        <w:rPr>
+          <w:color w:val="FF0000"/>
+        </w:rPr>
+        <w:t>​</w:t>
+      </w:r>
+    </w:p>
+    <w:p>
+      <w:pPr>
+        <w:rPr>
+          <w:color w:val="FF0000"/>
+        </w:rPr>
+      </w:pPr>
+      <w:r>
+        <w:rPr>
+          <w:rFonts w:hint="eastAsia"/>
+          <w:color w:val="FF0000"/>
+        </w:rPr>
+        <w:t>●예시</w:t>
+      </w:r>
+      <w:r>
+        <w:rPr>
+          <w:color w:val="FF0000"/>
+        </w:rPr>
+        <w:t>: I have begun to develop the aforementioned research interests since my PhD study, postdoctoral training, and a current faculty position at ~. My research style emphasizes hands-on experiments and creative, but rigorous, modeling work to solve the problem.</w:t>
+      </w:r>
+    </w:p>
+    <w:p>
+      <w:r>
+        <w:rPr>
+          <w:rFonts w:hint="eastAsia"/>
+          <w:color w:val="FF0000"/>
+        </w:rPr>
+        <w:t>●예시</w:t>
+      </w:r>
+      <w:r>
+        <w:rPr>
+          <w:color w:val="FF0000"/>
+        </w:rPr>
+        <w:t>: More recently, I have been working on ~.</w:t>
+      </w:r>
+    </w:p>
+    <w:p>
+      <w:pPr>
+        <w:pStyle w:val="1"/>
+      </w:pPr>
       <w:r>
         <w:rPr>
           <w:rFonts w:hint="eastAsia"/>
         </w:rPr>
         <w:lastRenderedPageBreak/>
+        <w:t>F</w:t>
+      </w:r>
+      <w:r>
+        <w:t>uture Research</w:t>
+      </w:r>
+      <w:r>
+        <w:t xml:space="preserve"> </w:t>
+      </w:r>
+      <w:r>
+        <w:rPr>
+          <w:rFonts w:hint="eastAsia"/>
+        </w:rPr>
+        <w:t xml:space="preserve">(해본 거에 대한 </w:t>
+      </w:r>
+      <w:r>
+        <w:t>future</w:t>
+      </w:r>
+      <w:r>
+        <w:rPr>
+          <w:rFonts w:hint="eastAsia"/>
+        </w:rPr>
+        <w:t>도 포함)</w:t>
+      </w:r>
+    </w:p>
+    <w:p>
+      <w:pPr>
+        <w:rPr>
+          <w:rFonts w:hint="eastAsia"/>
+        </w:rPr>
+      </w:pPr>
+      <w:r>
+        <w:rPr>
+          <w:rFonts w:hint="eastAsia"/>
+        </w:rPr>
+        <w:t xml:space="preserve">나는 </w:t>
+      </w:r>
+      <w:r>
+        <w:rPr>
+          <w:rFonts w:hint="eastAsia"/>
+        </w:rPr>
+        <w:t>M</w:t>
+      </w:r>
+      <w:r>
+        <w:t>atrix equation</w:t>
+      </w:r>
+      <w:r>
+        <w:rPr>
+          <w:rFonts w:hint="eastAsia"/>
+        </w:rPr>
+        <w:t xml:space="preserve">의 </w:t>
+      </w:r>
+      <w:r>
+        <w:t>solution</w:t>
+      </w:r>
+      <w:r>
+        <w:rPr>
+          <w:rFonts w:hint="eastAsia"/>
+        </w:rPr>
+        <w:t xml:space="preserve">을 구하는 </w:t>
+      </w:r>
+      <w:r>
+        <w:t>iterative method</w:t>
+      </w:r>
+      <w:r>
+        <w:rPr>
+          <w:rFonts w:hint="eastAsia"/>
+        </w:rPr>
+        <w:t>에</w:t>
+      </w:r>
+      <w:r>
+        <w:rPr>
+          <w:rFonts w:hint="eastAsia"/>
+        </w:rPr>
+        <w:t xml:space="preserve"> 대해 연구하면서 </w:t>
+      </w:r>
+      <w:r>
+        <w:t>matrix</w:t>
+      </w:r>
+      <w:r>
+        <w:rPr>
+          <w:rFonts w:hint="eastAsia"/>
+        </w:rPr>
+        <w:t>에 대한 이해와 알고리즘 구현 능력을 높였고,</w:t>
+      </w:r>
+      <w:r>
+        <w:t xml:space="preserve"> </w:t>
+      </w:r>
+      <w:r>
+        <w:rPr>
+          <w:rFonts w:hint="eastAsia"/>
+        </w:rPr>
+        <w:t xml:space="preserve">이로 인해 이전에 있던 연구소에서는 산업 및 의료계에서 활용될 이미지 프로세싱 </w:t>
+      </w:r>
+      <w:r>
+        <w:t xml:space="preserve">neural network </w:t>
+      </w:r>
+      <w:r>
+        <w:rPr>
+          <w:rFonts w:hint="eastAsia"/>
+        </w:rPr>
+        <w:t>알고리즘 개발에 도움이 되었다.</w:t>
+      </w:r>
+      <w:r>
+        <w:t xml:space="preserve"> </w:t>
+      </w:r>
+      <w:r>
+        <w:rPr>
+          <w:rFonts w:hint="eastAsia"/>
+        </w:rPr>
+        <w:t>이를 바탕으로,</w:t>
+      </w:r>
+      <w:r>
+        <w:t xml:space="preserve"> AI </w:t>
+      </w:r>
+      <w:r>
+        <w:rPr>
+          <w:rFonts w:hint="eastAsia"/>
+        </w:rPr>
+        <w:t xml:space="preserve">기초과학센터에서 </w:t>
+      </w:r>
+      <w:r>
+        <w:t xml:space="preserve">deep learning </w:t>
+      </w:r>
+      <w:r>
+        <w:rPr>
+          <w:rFonts w:hint="eastAsia"/>
+        </w:rPr>
+        <w:t>연구의 최신 트렌드에 대해 배우고 이미지 프로세싱 모델</w:t>
+      </w:r>
+      <w:r>
+        <w:rPr>
+          <w:rFonts w:hint="eastAsia"/>
+        </w:rPr>
+        <w:t xml:space="preserve"> </w:t>
+      </w:r>
+      <w:r>
+        <w:rPr>
+          <w:rFonts w:hint="eastAsia"/>
+        </w:rPr>
+        <w:t>뿐만 아니라,</w:t>
+      </w:r>
+      <w:r>
+        <w:t xml:space="preserve"> </w:t>
+      </w:r>
+      <w:r>
+        <w:rPr>
+          <w:rFonts w:hint="eastAsia"/>
+        </w:rPr>
+        <w:t xml:space="preserve">다양한 </w:t>
+      </w:r>
+      <w:r>
+        <w:rPr>
+          <w:rFonts w:hint="eastAsia"/>
+        </w:rPr>
+        <w:t>모델에 대해 알아가며,</w:t>
+      </w:r>
+      <w:r>
+        <w:t xml:space="preserve"> </w:t>
+      </w:r>
+      <w:r>
+        <w:rPr>
+          <w:rFonts w:hint="eastAsia"/>
+        </w:rPr>
+        <w:t xml:space="preserve">최종적으로 </w:t>
+      </w:r>
+      <w:r>
+        <w:t>matrix equation</w:t>
+      </w:r>
+      <w:r>
+        <w:rPr>
+          <w:rFonts w:hint="eastAsia"/>
+        </w:rPr>
+        <w:t xml:space="preserve">의 </w:t>
+      </w:r>
+      <w:r>
+        <w:t>solution</w:t>
+      </w:r>
+      <w:r>
+        <w:rPr>
+          <w:rFonts w:hint="eastAsia"/>
+        </w:rPr>
+        <w:t xml:space="preserve">을 좀 더 효율적으로 찾아낼 </w:t>
+      </w:r>
+      <w:r>
+        <w:t xml:space="preserve">AI </w:t>
+      </w:r>
+      <w:r>
+        <w:rPr>
+          <w:rFonts w:hint="eastAsia"/>
+        </w:rPr>
+        <w:t>모델에 대해 연구하고 싶다.</w:t>
+      </w:r>
+    </w:p>
+    <w:p>
+      <w:pPr>
+        <w:pStyle w:val="4"/>
+        <w:rPr>
+          <w:rFonts w:hint="eastAsia"/>
+          <w:color w:val="FF0000"/>
+        </w:rPr>
+      </w:pPr>
+      <w:r>
+        <w:rPr>
+          <w:rFonts w:hint="eastAsia"/>
+          <w:color w:val="FF0000"/>
+        </w:rPr>
+        <w:t>부가설명</w:t>
+      </w:r>
+    </w:p>
+    <w:p>
+      <w:pPr>
+        <w:rPr>
+          <w:color w:val="FF0000"/>
+        </w:rPr>
+      </w:pPr>
+      <w:r>
+        <w:rPr>
+          <w:rFonts w:hint="eastAsia"/>
+          <w:color w:val="FF0000"/>
+        </w:rPr>
+        <w:t>지금까지의</w:t>
+      </w:r>
+      <w:r>
+        <w:rPr>
+          <w:color w:val="FF0000"/>
+        </w:rPr>
+        <w:t xml:space="preserve"> 연구 경험을 바탕으로 앞으로 수행할 연구 계획을 서술합니다. </w:t>
+      </w:r>
+    </w:p>
+    <w:p>
+      <w:pPr>
+        <w:rPr>
+          <w:color w:val="FF0000"/>
+        </w:rPr>
+      </w:pPr>
+      <w:r>
+        <w:rPr>
+          <w:rFonts w:hint="eastAsia"/>
+          <w:color w:val="FF0000"/>
+        </w:rPr>
+        <w:t>과거</w:t>
+      </w:r>
+      <w:r>
+        <w:rPr>
+          <w:color w:val="FF0000"/>
+        </w:rPr>
+        <w:t>, 현재 연구 내용보다 더 중요하게 검토될 수 있어 가능하면 자세하고 구체적으로 서술합니다.</w:t>
+      </w:r>
+    </w:p>
+    <w:p>
+      <w:pPr>
+        <w:rPr>
+          <w:color w:val="FF0000"/>
+        </w:rPr>
+      </w:pPr>
+      <w:r>
+        <w:rPr>
+          <w:rFonts w:hint="eastAsia"/>
+          <w:color w:val="FF0000"/>
+        </w:rPr>
+        <w:t>기존</w:t>
+      </w:r>
+      <w:r>
+        <w:rPr>
+          <w:color w:val="FF0000"/>
+        </w:rPr>
+        <w:t xml:space="preserve"> 연구들의 후속 연구도 좋고 지원하는 기관에서 수행하고 싶은 연구를 제안하는 방식으로 서술해도 좋습니다.</w:t>
+      </w:r>
+    </w:p>
+    <w:p>
+      <w:pPr>
+        <w:rPr>
+          <w:color w:val="FF0000"/>
+        </w:rPr>
+      </w:pPr>
+      <w:r>
+        <w:rPr>
+          <w:rFonts w:hint="eastAsia"/>
+          <w:color w:val="FF0000"/>
+        </w:rPr>
+        <w:t>자신의</w:t>
+      </w:r>
+      <w:r>
+        <w:rPr>
+          <w:color w:val="FF0000"/>
+        </w:rPr>
+        <w:t xml:space="preserve"> 연구가 지원하는 기관과 다를수록 해당 교수, 기관에 대해 자세히 조사한 후 공동으로 수행할 수 있는 연구들을 실현 가능해 보이도록 작성합시다. 지금까지 이런 연구를 수행했고 최근 이런 연구들이 각광받고 있으니 앞으로 어떠한 연구를 수행하고 싶다고 작성합니다.</w:t>
+      </w:r>
+    </w:p>
+    <w:p>
+      <w:pPr>
+        <w:rPr>
+          <w:color w:val="FF0000"/>
+        </w:rPr>
+      </w:pPr>
+    </w:p>
+    <w:p>
+      <w:pPr>
+        <w:rPr>
+          <w:color w:val="FF0000"/>
+        </w:rPr>
+      </w:pPr>
+      <w:r>
+        <w:rPr>
+          <w:rFonts w:hint="eastAsia"/>
+          <w:color w:val="FF0000"/>
+        </w:rPr>
         <w:t>●예시</w:t>
       </w:r>
       <w:r>
-        <w:t xml:space="preserve">: My research interests are in three major areas: sustainable manufacturing, ~manufacturing, ~manufacturing. I have been inspired to explore them further with my background expertise in design, </w:t>
-      </w:r>
-      <w:proofErr w:type="gramStart"/>
-      <w:r>
-        <w:t>manufacturing</w:t>
-      </w:r>
-      <w:proofErr w:type="gramEnd"/>
-      <w:r>
-        <w:t xml:space="preserve"> and mechanics. Specific topics are summarized below:</w:t>
-      </w:r>
-    </w:p>
-    <w:p/>
-    <w:p>
-      <w:r>
-        <w:rPr>
-          <w:rFonts w:hint="eastAsia"/>
+        <w:rPr>
+          <w:color w:val="FF0000"/>
+        </w:rPr>
+        <w:t>: So far, my research has focused primarily on t~. In recent years, ~ has emerged as a promising approach in enhancing ~. These sequential researches of ~ are necessary for ~. I plan to apply ~ to ~.</w:t>
+      </w:r>
+    </w:p>
+    <w:p>
+      <w:pPr>
+        <w:rPr>
+          <w:color w:val="FF0000"/>
+        </w:rPr>
+      </w:pPr>
+      <w:r>
+        <w:rPr>
+          <w:rFonts w:hint="eastAsia"/>
+          <w:color w:val="FF0000"/>
         </w:rPr>
         <w:t>●예시</w:t>
       </w:r>
       <w:r>
-        <w:t xml:space="preserve">: My research goal is to create new knowledge and make a positive impact in the industry and ~. Detailed information for each aforementioned area, including the motivation, is given in the following </w:t>
-      </w:r>
-      <w:proofErr w:type="gramStart"/>
-      <w:r>
-        <w:t>subsections;</w:t>
-      </w:r>
-      <w:proofErr w:type="gramEnd"/>
-    </w:p>
-    <w:p/>
-    <w:p>
-      <w:r>
-        <w:rPr>
-          <w:rFonts w:hint="eastAsia"/>
+        <w:rPr>
+          <w:color w:val="FF0000"/>
+        </w:rPr>
+        <w:t>: Moving forward, I plan to address ~. I plan to apply my methodological develoopments to address ~.</w:t>
+      </w:r>
+    </w:p>
+    <w:p>
+      <w:pPr>
+        <w:rPr>
+          <w:color w:val="FF0000"/>
+        </w:rPr>
+      </w:pPr>
+      <w:r>
+        <w:rPr>
+          <w:rFonts w:hint="eastAsia"/>
+          <w:color w:val="FF0000"/>
         </w:rPr>
         <w:t>●예시</w:t>
       </w:r>
       <w:r>
-        <w:t>: My research focus in ~. This work encompasses improving ~. I believe that this direction is the key to enabling new levels of performance, efficiency, and ~.</w:t>
-      </w:r>
-    </w:p>
-    <w:p/>
-    <w:p>
-      <w:r>
-        <w:rPr>
-          <w:rFonts w:hint="eastAsia"/>
+        <w:rPr>
+          <w:color w:val="FF0000"/>
+        </w:rPr>
+        <w:t xml:space="preserve">: Follow-up Study of ~. </w:t>
+      </w:r>
+    </w:p>
+    <w:p>
+      <w:r>
+        <w:rPr>
+          <w:rFonts w:hint="eastAsia"/>
+          <w:color w:val="FF0000"/>
         </w:rPr>
         <w:t>●예시</w:t>
       </w:r>
       <w:r>
-        <w:t xml:space="preserve">: Early in my research career, I worked on ~. In my future research, I will develop new ~. </w:t>
-      </w:r>
-    </w:p>
-    <w:p/>
-    <w:p>
-      <w:r>
-        <w:rPr>
-          <w:rFonts w:hint="eastAsia"/>
-        </w:rPr>
-        <w:t>●예시</w:t>
-      </w:r>
-      <w:r>
-        <w:t>: My career goal is to make ~.</w:t>
-      </w:r>
-    </w:p>
-    <w:p/>
-    <w:p>
-      <w:r>
-        <w:rPr>
-          <w:rFonts w:hint="eastAsia"/>
-        </w:rPr>
-        <w:t>●예시</w:t>
-      </w:r>
-      <w:r>
-        <w:t>: My mission is to become a world leader on systems and control tools for ~.</w:t>
-      </w:r>
-    </w:p>
-    <w:p/>
-    <w:p>
-      <w:r>
-        <w:t>​추가로 이러한 목적을 이루기 위해 자신이 가진 기술, 노력한 점을 간단히 서술합니다.</w:t>
-      </w:r>
-    </w:p>
-    <w:p>
-      <w:r>
-        <w:t>​</w:t>
-      </w:r>
-    </w:p>
-    <w:p>
-      <w:r>
-        <w:rPr>
-          <w:rFonts w:hint="eastAsia"/>
-        </w:rPr>
-        <w:t>●예시</w:t>
-      </w:r>
-      <w:r>
-        <w:t xml:space="preserve"> 문장: For these objectives, ~ has been my research principle. With the skilled ~ techniques, I explore both ~ and ~. As an ~ engineer (or scientist), I view the area of ~ that will solve the ~ problems. </w:t>
-      </w:r>
-    </w:p>
-    <w:p/>
-    <w:p>
-      <w:r>
-        <w:rPr>
-          <w:rFonts w:hint="eastAsia"/>
-        </w:rPr>
-        <w:t>●예시</w:t>
-      </w:r>
-      <w:r>
-        <w:t>: To address these questions, my research utilizes ~ to characterize ~ systems.</w:t>
-      </w:r>
-    </w:p>
-    <w:p/>
-    <w:p>
-      <w:r>
-        <w:rPr>
-          <w:rFonts w:hint="eastAsia"/>
-        </w:rPr>
-        <w:t>●예시</w:t>
-      </w:r>
-      <w:r>
-        <w:t>: I have carefully prepared myself to achieve the aforementioned goals in the following ways:</w:t>
-      </w:r>
-    </w:p>
-    <w:p/>
-    <w:p>
-      <w:r>
-        <w:rPr>
-          <w:rFonts w:hint="eastAsia"/>
-        </w:rPr>
-        <w:t>●예시</w:t>
-      </w:r>
-      <w:r>
-        <w:t>: My leadership skills, accomplishments, expertise, and interests provide a strong foundation to achieve this goal.</w:t>
-      </w:r>
-    </w:p>
-    <w:p>
-      <w:pPr>
-        <w:pStyle w:val="1"/>
-      </w:pPr>
-      <w:r>
-        <w:rPr>
-          <w:rFonts w:hint="eastAsia"/>
-        </w:rPr>
-        <w:t>P</w:t>
-      </w:r>
-      <w:r>
-        <w:t>ast Research</w:t>
-      </w:r>
-    </w:p>
-    <w:p>
-      <w:r>
-        <w:rPr>
-          <w:rFonts w:hint="eastAsia"/>
-        </w:rPr>
-        <w:t>다음</w:t>
-      </w:r>
-      <w:r>
-        <w:t xml:space="preserve"> 항목에는 학위 기간 또는 지난 연구 경력 동안 완료한 연구들을 주제별로 나누어 자세히 서술하는 항목입니다.</w:t>
-      </w:r>
-    </w:p>
-    <w:p/>
-    <w:p>
-      <w:r>
-        <w:rPr>
-          <w:rFonts w:hint="eastAsia"/>
-        </w:rPr>
-        <w:t>주제별로</w:t>
-      </w:r>
-      <w:r>
-        <w:t xml:space="preserve"> 설명하기 전, 자신이 연구한 내용 중에 가장 </w:t>
-      </w:r>
-      <w:proofErr w:type="spellStart"/>
-      <w:r>
-        <w:t>노블한</w:t>
-      </w:r>
-      <w:proofErr w:type="spellEnd"/>
-      <w:r>
-        <w:t xml:space="preserve"> 포인트를 설명해 주거나 이 연구들이 왜 필요한 지 설명합니다.</w:t>
-      </w:r>
-    </w:p>
-    <w:p/>
-    <w:p>
-      <w:r>
-        <w:rPr>
-          <w:rFonts w:hint="eastAsia"/>
-        </w:rPr>
-        <w:t>또는</w:t>
-      </w:r>
-      <w:r>
-        <w:t>, 각 연구 주제를 이해하는 데 필요한 기본 지식, 용어를 논문의 introduction처럼 먼저 대략 설명해 주어도 좋습니다.</w:t>
-      </w:r>
-    </w:p>
-    <w:p/>
-    <w:p>
-      <w:r>
-        <w:rPr>
-          <w:rFonts w:hint="eastAsia"/>
-        </w:rPr>
-        <w:t>●예시</w:t>
-      </w:r>
-      <w:r>
-        <w:t>: The most notable finding of my Ph.D. research was the development of ~ for ~.</w:t>
-      </w:r>
-    </w:p>
-    <w:p/>
-    <w:p>
-      <w:r>
-        <w:rPr>
-          <w:rFonts w:hint="eastAsia"/>
-        </w:rPr>
-        <w:t>●예시</w:t>
-      </w:r>
-      <w:r>
-        <w:t>: Therefore, the magnitude of the problem necessitates the research for ~ materials to replace ~.</w:t>
-      </w:r>
-    </w:p>
-    <w:p/>
-    <w:p>
-      <w:r>
-        <w:t>​추가적으로 연구 주제의 대략적인 제목을 서술하고 한~두 문단으로 연구 요약 내용을 서술합니다.</w:t>
-      </w:r>
-    </w:p>
-    <w:p/>
-    <w:p>
-      <w:r>
-        <w:rPr>
-          <w:rFonts w:hint="eastAsia"/>
-        </w:rPr>
-        <w:lastRenderedPageBreak/>
-        <w:t>연구</w:t>
-      </w:r>
-      <w:r>
-        <w:t xml:space="preserve"> 주제의 제목은 논문 제목을 그대로 사용하기보다는 Development </w:t>
-      </w:r>
-      <w:proofErr w:type="gramStart"/>
-      <w:r>
-        <w:t>of  ~</w:t>
-      </w:r>
-      <w:proofErr w:type="gramEnd"/>
-      <w:r>
-        <w:t>, Comparative Study of ~처럼 명사로 설정하는 것이 좋습니다. 취향에 따라 항목으로 설정하지 않고 한 문단에 지난 연구를 모두 포함해서 서술해도 됩니다.</w:t>
-      </w:r>
-    </w:p>
-    <w:p/>
-    <w:p>
-      <w:r>
-        <w:rPr>
-          <w:rFonts w:hint="eastAsia"/>
-        </w:rPr>
-        <w:t>●예시</w:t>
-      </w:r>
-      <w:r>
-        <w:t xml:space="preserve">: Comparative Study of Peroxide Oxidants Activated by </w:t>
-      </w:r>
-      <w:proofErr w:type="spellStart"/>
-      <w:r>
-        <w:t>nZVI</w:t>
-      </w:r>
-      <w:proofErr w:type="spellEnd"/>
-    </w:p>
-    <w:p/>
-    <w:p>
-      <w:r>
-        <w:t>Combining oxidant and ZVI is possible to utilize adsorption and coprecipitation reactions as well as oxidation. The performance of nano-sized ZVI (</w:t>
-      </w:r>
-      <w:proofErr w:type="spellStart"/>
-      <w:r>
-        <w:t>nZVI</w:t>
-      </w:r>
-      <w:proofErr w:type="spellEnd"/>
-      <w:r>
-        <w:t xml:space="preserve">) in the presence of the common oxidants (persulfate, </w:t>
-      </w:r>
-      <w:proofErr w:type="spellStart"/>
-      <w:r>
-        <w:t>peroxymonosulfate</w:t>
-      </w:r>
-      <w:proofErr w:type="spellEnd"/>
-      <w:r>
-        <w:t xml:space="preserve"> and hydrogen peroxide) was tested toward organic/inorganic contaminants, 1,4-dioxane and </w:t>
-      </w:r>
-      <w:proofErr w:type="gramStart"/>
-      <w:r>
-        <w:t>As(</w:t>
-      </w:r>
-      <w:proofErr w:type="gramEnd"/>
-      <w:r>
-        <w:t xml:space="preserve">III). The persulfate showed the highest removal toward 1,4-Dixane and </w:t>
-      </w:r>
-      <w:proofErr w:type="gramStart"/>
-      <w:r>
-        <w:t>As(</w:t>
-      </w:r>
-      <w:proofErr w:type="gramEnd"/>
-      <w:r>
-        <w:t xml:space="preserve">III), followed by hydrogen peroxide and </w:t>
-      </w:r>
-      <w:proofErr w:type="spellStart"/>
-      <w:r>
-        <w:t>peroxymonosulfate</w:t>
-      </w:r>
-      <w:proofErr w:type="spellEnd"/>
-      <w:r>
-        <w:t xml:space="preserve"> in order. This study provided a possible application of oxidant/ZVI systems for complex contaminated sites.</w:t>
-      </w:r>
-    </w:p>
-    <w:p>
-      <w:pPr>
-        <w:pStyle w:val="1"/>
-      </w:pPr>
-      <w:r>
-        <w:rPr>
-          <w:rFonts w:hint="eastAsia"/>
-        </w:rPr>
-        <w:t>C</w:t>
-      </w:r>
-      <w:r>
-        <w:t>urrent Research</w:t>
-      </w:r>
-    </w:p>
-    <w:p>
-      <w:r>
-        <w:t>Past research와 거의 비슷하지만 아직 논문으로 출간되지 않은 현재 진행 중인 연구에 대해 서술합니다.</w:t>
-      </w:r>
-    </w:p>
-    <w:p/>
-    <w:p>
-      <w:r>
-        <w:rPr>
-          <w:rFonts w:hint="eastAsia"/>
-        </w:rPr>
-        <w:t>학위</w:t>
-      </w:r>
-      <w:r>
-        <w:t xml:space="preserve"> 받은 곳이 아닌 다른 곳에서 일하고 있다면 현재 일하는 곳에서 수행하는 과제나 연구 내용을 서술하면 되겠죠.</w:t>
-      </w:r>
-    </w:p>
-    <w:p/>
-    <w:p>
-      <w:r>
-        <w:rPr>
-          <w:rFonts w:hint="eastAsia"/>
-        </w:rPr>
-        <w:t>과거에</w:t>
-      </w:r>
-      <w:r>
-        <w:t xml:space="preserve"> 수행했던 연구보다 주제 개수는 적을지라도 연구 목적, 결과에 대해 더 자세히 서술하시는 것을 추천합니다.</w:t>
-      </w:r>
-    </w:p>
-    <w:p/>
-    <w:p>
-      <w:r>
-        <w:rPr>
-          <w:rFonts w:hint="eastAsia"/>
-        </w:rPr>
-        <w:t>연구</w:t>
-      </w:r>
-      <w:r>
-        <w:t xml:space="preserve"> 목표에서 서술했을 수도 있지만 자신의 연구 스타일에 대해서도 언급할 수 있습니다.</w:t>
-      </w:r>
-    </w:p>
-    <w:p>
-      <w:r>
-        <w:t>​</w:t>
-      </w:r>
-    </w:p>
-    <w:p>
-      <w:r>
-        <w:rPr>
-          <w:rFonts w:hint="eastAsia"/>
-        </w:rPr>
-        <w:lastRenderedPageBreak/>
-        <w:t>●예시</w:t>
-      </w:r>
-      <w:r>
-        <w:t>: I have begun to develop the aforementioned research interests since my PhD study, postdoctoral training, and a current faculty position at ~. My research style emphasizes hands-on experiments and creative, but rigorous, modeling work to solve the problem.</w:t>
-      </w:r>
-    </w:p>
-    <w:p/>
-    <w:p>
-      <w:r>
-        <w:rPr>
-          <w:rFonts w:hint="eastAsia"/>
-        </w:rPr>
-        <w:t>●예시</w:t>
-      </w:r>
-      <w:r>
-        <w:t>: More recently, I have been working on ~.</w:t>
-      </w:r>
-    </w:p>
-    <w:p>
-      <w:pPr>
-        <w:pStyle w:val="1"/>
-      </w:pPr>
-      <w:r>
-        <w:rPr>
-          <w:rFonts w:hint="eastAsia"/>
-        </w:rPr>
-        <w:t>F</w:t>
-      </w:r>
-      <w:r>
-        <w:t>uture Research</w:t>
-      </w:r>
-    </w:p>
-    <w:p>
-      <w:r>
-        <w:rPr>
-          <w:rFonts w:hint="eastAsia"/>
-        </w:rPr>
-        <w:t>지금까지의</w:t>
-      </w:r>
-      <w:r>
-        <w:t xml:space="preserve"> 연구 경험을 바탕으로 앞으로 수행할 연구 계획을 서술합니다. </w:t>
-      </w:r>
-    </w:p>
-    <w:p/>
-    <w:p>
-      <w:r>
-        <w:rPr>
-          <w:rFonts w:hint="eastAsia"/>
-        </w:rPr>
-        <w:t>과거</w:t>
-      </w:r>
-      <w:r>
-        <w:t>, 현재 연구 내용보다 더 중요하게 검토될 수 있어 가능하면 자세하고 구체적으로 서술합니다.</w:t>
-      </w:r>
-    </w:p>
-    <w:p/>
-    <w:p>
-      <w:r>
-        <w:rPr>
-          <w:rFonts w:hint="eastAsia"/>
-        </w:rPr>
-        <w:t>기존</w:t>
-      </w:r>
-      <w:r>
-        <w:t xml:space="preserve"> 연구들의 후속 연구도 좋고 지원하는 기관에서 수행하고 싶은 연구를 제안하는 방식으로 서술해도 좋습니다.</w:t>
-      </w:r>
-    </w:p>
-    <w:p/>
-    <w:p>
-      <w:r>
-        <w:rPr>
-          <w:rFonts w:hint="eastAsia"/>
-        </w:rPr>
-        <w:t>자신의</w:t>
-      </w:r>
-      <w:r>
-        <w:t xml:space="preserve"> 연구가 지원하는 기관과 다를수록 해당 교수, 기관에 대해 자세히 조사한 후 공동으로 수행할 수 있는 연구들을 실현 가능해 보이도록 작성합시다. 지금까지 이런 연구를 수행했고 최근 이런 연구들이 각광받고 있으니 앞으로 어떠한 연구를 수행하고 싶다고 작성합니다.</w:t>
-      </w:r>
-    </w:p>
-    <w:p/>
-    <w:p>
-      <w:r>
-        <w:rPr>
-          <w:rFonts w:hint="eastAsia"/>
-        </w:rPr>
-        <w:t>●예시</w:t>
-      </w:r>
-      <w:r>
-        <w:t xml:space="preserve">: So far, my research has focused primarily on t~. In recent years, ~ has emerged as a promising approach in enhancing ~. These sequential </w:t>
-      </w:r>
-      <w:proofErr w:type="gramStart"/>
-      <w:r>
-        <w:t>researches</w:t>
-      </w:r>
-      <w:proofErr w:type="gramEnd"/>
-      <w:r>
-        <w:t xml:space="preserve"> of ~ are necessary for ~. I plan to apply ~ to ~.</w:t>
-      </w:r>
-    </w:p>
-    <w:p/>
-    <w:p>
-      <w:r>
-        <w:rPr>
-          <w:rFonts w:hint="eastAsia"/>
-        </w:rPr>
-        <w:t>●예시</w:t>
-      </w:r>
-      <w:r>
-        <w:t xml:space="preserve">: Moving forward, I plan to address ~. I plan to apply my methodological </w:t>
-      </w:r>
-      <w:proofErr w:type="spellStart"/>
-      <w:r>
-        <w:t>develoopments</w:t>
-      </w:r>
-      <w:proofErr w:type="spellEnd"/>
-      <w:r>
-        <w:t xml:space="preserve"> to address ~.</w:t>
-      </w:r>
-    </w:p>
-    <w:p/>
-    <w:p>
-      <w:r>
-        <w:rPr>
-          <w:rFonts w:hint="eastAsia"/>
-        </w:rPr>
-        <w:lastRenderedPageBreak/>
-        <w:t>●예시</w:t>
-      </w:r>
-      <w:r>
-        <w:t xml:space="preserve">: Follow-up Study of ~. </w:t>
-      </w:r>
-    </w:p>
-    <w:p/>
-    <w:p>
-      <w:pPr>
-        <w:rPr>
-          <w:rFonts w:hint="eastAsia"/>
-        </w:rPr>
-      </w:pPr>
-      <w:r>
-        <w:rPr>
-          <w:rFonts w:hint="eastAsia"/>
-        </w:rPr>
-        <w:t>●예시</w:t>
-      </w:r>
-      <w:r>
+        <w:rPr>
+          <w:color w:val="FF0000"/>
+        </w:rPr>
         <w:t>: In my future research, I will develop ~. I will also work on ~ technology to use ~.</w:t>
       </w:r>
     </w:p>
@@ -773,6 +1706,7 @@
     <w:lsdException w:name="HTML Sample" w:semiHidden="1" w:unhideWhenUsed="1"/>
     <w:lsdException w:name="HTML Typewriter" w:semiHidden="1" w:unhideWhenUsed="1"/>
     <w:lsdException w:name="HTML Variable" w:semiHidden="1" w:unhideWhenUsed="1"/>
+    <w:lsdException w:name="Normal Table" w:semiHidden="1" w:unhideWhenUsed="1"/>
     <w:lsdException w:name="annotation subject" w:semiHidden="1" w:unhideWhenUsed="1"/>
     <w:lsdException w:name="No List" w:semiHidden="1" w:unhideWhenUsed="1"/>
     <w:lsdException w:name="Outline List 1" w:semiHidden="1" w:unhideWhenUsed="1"/>
@@ -819,8 +1753,10 @@
     <w:lsdException w:name="Table Subtle 2" w:semiHidden="1" w:unhideWhenUsed="1"/>
     <w:lsdException w:name="Table Web 1" w:semiHidden="1" w:unhideWhenUsed="1"/>
     <w:lsdException w:name="Table Web 2" w:semiHidden="1" w:unhideWhenUsed="1"/>
+    <w:lsdException w:name="Table Web 3" w:semiHidden="1" w:unhideWhenUsed="1"/>
     <w:lsdException w:name="Balloon Text" w:semiHidden="1" w:unhideWhenUsed="1"/>
     <w:lsdException w:name="Table Grid" w:uiPriority="39"/>
+    <w:lsdException w:name="Table Theme" w:semiHidden="1" w:unhideWhenUsed="1"/>
     <w:lsdException w:name="Placeholder Text" w:semiHidden="1"/>
     <w:lsdException w:name="No Spacing" w:uiPriority="1" w:qFormat="1"/>
     <w:lsdException w:name="Light Shading" w:uiPriority="60"/>
@@ -1074,7 +2010,6 @@
     <w:next w:val="a"/>
     <w:link w:val="2Char"/>
     <w:uiPriority w:val="9"/>
-    <w:semiHidden/>
     <w:unhideWhenUsed/>
     <w:qFormat/>
     <w:rsid w:val="00864AD4"/>
@@ -1097,7 +2032,6 @@
     <w:next w:val="a"/>
     <w:link w:val="3Char"/>
     <w:uiPriority w:val="9"/>
-    <w:semiHidden/>
     <w:unhideWhenUsed/>
     <w:qFormat/>
     <w:rsid w:val="00864AD4"/>
@@ -1120,7 +2054,6 @@
     <w:next w:val="a"/>
     <w:link w:val="4Char"/>
     <w:uiPriority w:val="9"/>
-    <w:semiHidden/>
     <w:unhideWhenUsed/>
     <w:qFormat/>
     <w:rsid w:val="00864AD4"/>
@@ -1286,7 +2219,6 @@
     <w:basedOn w:val="a0"/>
     <w:link w:val="2"/>
     <w:uiPriority w:val="9"/>
-    <w:semiHidden/>
     <w:rsid w:val="00864AD4"/>
     <w:rPr>
       <w:rFonts w:asciiTheme="majorHAnsi" w:eastAsiaTheme="majorEastAsia" w:hAnsiTheme="majorHAnsi" w:cstheme="majorBidi"/>
@@ -1300,7 +2232,6 @@
     <w:basedOn w:val="a0"/>
     <w:link w:val="3"/>
     <w:uiPriority w:val="9"/>
-    <w:semiHidden/>
     <w:rsid w:val="00864AD4"/>
     <w:rPr>
       <w:rFonts w:asciiTheme="majorHAnsi" w:eastAsiaTheme="majorEastAsia" w:hAnsiTheme="majorHAnsi" w:cstheme="majorBidi"/>
@@ -1314,7 +2245,6 @@
     <w:basedOn w:val="a0"/>
     <w:link w:val="4"/>
     <w:uiPriority w:val="9"/>
-    <w:semiHidden/>
     <w:rsid w:val="00864AD4"/>
     <w:rPr>
       <w:i/>

</xml_diff>

<commit_message>
Last help from my love
</commit_message>
<xml_diff>
--- a/ResearchStatement_SSH.docx
+++ b/ResearchStatement_SSH.docx
@@ -71,12 +71,27 @@
         <w:t xml:space="preserve">. </w:t>
       </w:r>
       <w:r>
-        <w:t>Through these interests, I want to reach my research objective that solving application problems with computer algorithms.</w:t>
+        <w:t xml:space="preserve">Through these interests, I want to reach my research objective </w:t>
+      </w:r>
+      <w:r>
+        <w:t>of</w:t>
+      </w:r>
+      <w:r>
+        <w:t xml:space="preserve"> solv</w:t>
+      </w:r>
+      <w:r>
+        <w:t>ing</w:t>
+      </w:r>
+      <w:r>
+        <w:t xml:space="preserve"> application problems with computer algorithms.</w:t>
       </w:r>
     </w:p>
     <w:p>
       <w:r>
-        <w:t>Solving nonlinear matrix equation</w:t>
+        <w:t>Algorithms to solve</w:t>
+      </w:r>
+      <w:r>
+        <w:t xml:space="preserve"> nonlinear matrix equation</w:t>
       </w:r>
       <w:r>
         <w:t>s</w:t>
@@ -94,13 +109,31 @@
         <w:t>extensive application problems</w:t>
       </w:r>
       <w:r>
-        <w:t xml:space="preserve"> -</w:t>
-      </w:r>
-      <w:r>
-        <w:t xml:space="preserve"> </w:t>
-      </w:r>
-      <w:r>
-        <w:t xml:space="preserve">to get stationary vector for various queueing models, or to solve generalized eigenvalue problems </w:t>
+        <w:t xml:space="preserve"> </w:t>
+      </w:r>
+      <w:r>
+        <w:t>–</w:t>
+      </w:r>
+      <w:r>
+        <w:t xml:space="preserve"> </w:t>
+      </w:r>
+      <w:r>
+        <w:t>to estimate the</w:t>
+      </w:r>
+      <w:r>
+        <w:t xml:space="preserve"> stationary vector</w:t>
+      </w:r>
+      <w:r>
+        <w:t>s</w:t>
+      </w:r>
+      <w:r>
+        <w:t xml:space="preserve"> for various queueing models, or </w:t>
+      </w:r>
+      <w:r>
+        <w:t>to solve</w:t>
+      </w:r>
+      <w:r>
+        <w:t xml:space="preserve"> generalized eigenvalue problems </w:t>
       </w:r>
       <w:r>
         <w:t xml:space="preserve">in </w:t>
@@ -109,27 +142,126 @@
         <w:t xml:space="preserve">overdamped problems. </w:t>
       </w:r>
       <w:r>
-        <w:t>Various</w:t>
+        <w:t>Although there exist v</w:t>
+      </w:r>
+      <w:r>
+        <w:t>arious</w:t>
       </w:r>
       <w:r>
         <w:t xml:space="preserve"> direct methods </w:t>
       </w:r>
       <w:r>
-        <w:t xml:space="preserve">also have been suggested to solve various nonlinear matrix equations. But, one iterative method can cover wider area of problems than one direct method. So, it is also an important issue researching accelerations of iterative methods. </w:t>
-      </w:r>
-      <w:r>
-        <w:t xml:space="preserve">Until now, I have researched </w:t>
-      </w:r>
-      <w:r>
-        <w:t>acceleration techniques of Newton’s method as advanced iterative methods.</w:t>
+        <w:t xml:space="preserve">to </w:t>
+      </w:r>
+      <w:r>
+        <w:t>deal with</w:t>
+      </w:r>
+      <w:r>
+        <w:t xml:space="preserve"> nonlinear matrix equations</w:t>
+      </w:r>
+      <w:r>
+        <w:t>, an</w:t>
+      </w:r>
+      <w:r>
+        <w:t xml:space="preserve"> iterative method can cover wider area of problems than</w:t>
+      </w:r>
+      <w:r>
+        <w:t xml:space="preserve"> a</w:t>
+      </w:r>
+      <w:r>
+        <w:t xml:space="preserve"> direct method.</w:t>
+      </w:r>
+      <w:r>
+        <w:t xml:space="preserve"> Therefore,</w:t>
+      </w:r>
+      <w:r>
+        <w:t xml:space="preserve"> </w:t>
+      </w:r>
+      <w:r>
+        <w:t>it is also important to advance the performance</w:t>
+      </w:r>
+      <w:r>
+        <w:t xml:space="preserve"> of iterative methods. </w:t>
+      </w:r>
+      <w:r>
+        <w:t xml:space="preserve">Until now, I have </w:t>
+      </w:r>
+      <w:r>
+        <w:t>studied the</w:t>
+      </w:r>
+      <w:r>
+        <w:t xml:space="preserve"> </w:t>
+      </w:r>
+      <w:r>
+        <w:t xml:space="preserve">acceleration techniques of Newton’s method </w:t>
+      </w:r>
+      <w:r>
+        <w:t>which is one of the</w:t>
+      </w:r>
+      <w:r>
+        <w:t xml:space="preserve"> advanced iterative methods.</w:t>
       </w:r>
     </w:p>
     <w:p>
       <w:r>
-        <w:t>While I was in the previous institute, I have dealt with many medical images from hospitals in Busan to distinguish existence of diseases or to detect some parts of body.</w:t>
-      </w:r>
-      <w:r>
-        <w:t xml:space="preserve"> To do this works, I have studied and applied convolutional neural network models for classification or segmentation.</w:t>
+        <w:t xml:space="preserve">While I was in the previous institute, I dealt with </w:t>
+      </w:r>
+      <w:r>
+        <w:t>several types of</w:t>
+      </w:r>
+      <w:r>
+        <w:t xml:space="preserve"> medical images </w:t>
+      </w:r>
+      <w:r>
+        <w:t xml:space="preserve">provided by </w:t>
+      </w:r>
+      <w:r>
+        <w:t>hospitals in Busan to distinguish existence of diseases or to detect parts of</w:t>
+      </w:r>
+      <w:r>
+        <w:t xml:space="preserve"> the</w:t>
+      </w:r>
+      <w:r>
+        <w:t xml:space="preserve"> body.</w:t>
+      </w:r>
+      <w:r>
+        <w:t xml:space="preserve"> To</w:t>
+      </w:r>
+      <w:r>
+        <w:t xml:space="preserve"> accomplish</w:t>
+      </w:r>
+      <w:r>
+        <w:t xml:space="preserve"> th</w:t>
+      </w:r>
+      <w:r>
+        <w:t>ese</w:t>
+      </w:r>
+      <w:r>
+        <w:t xml:space="preserve"> </w:t>
+      </w:r>
+      <w:r>
+        <w:t>tasks</w:t>
+      </w:r>
+      <w:r>
+        <w:t xml:space="preserve">, I </w:t>
+      </w:r>
+      <w:r>
+        <w:t>trained myself with</w:t>
+      </w:r>
+      <w:r>
+        <w:t xml:space="preserve"> convolutional neural network models for classification or segmentation</w:t>
+      </w:r>
+      <w:r>
+        <w:t xml:space="preserve"> and applied these techniques </w:t>
+      </w:r>
+      <w:r>
+        <w:t>utilizing</w:t>
+      </w:r>
+      <w:r>
+        <w:t xml:space="preserve"> clinical data</w:t>
+      </w:r>
+      <w:r>
+        <w:t>.</w:t>
       </w:r>
     </w:p>
     <w:p>
@@ -157,7 +289,13 @@
         <w:t>I</w:t>
       </w:r>
       <w:r>
-        <w:t>terative Method solving nonlinear matrix equations</w:t>
+        <w:t>terative Method</w:t>
+      </w:r>
+      <w:r>
+        <w:t>s to solve</w:t>
+      </w:r>
+      <w:r>
+        <w:t xml:space="preserve"> nonlinear matrix equations</w:t>
       </w:r>
     </w:p>
     <w:p>
@@ -196,8 +334,13 @@
       </w:r>
     </w:p>
     <w:p>
-      <w:r>
-        <w:t xml:space="preserve">In particular, my research has focused on </w:t>
+      <w:proofErr w:type="gramStart"/>
+      <w:r>
+        <w:t>In particular, my</w:t>
+      </w:r>
+      <w:proofErr w:type="gramEnd"/>
+      <w:r>
+        <w:t xml:space="preserve"> research has focused on </w:t>
       </w:r>
       <w:r>
         <w:t>Newton’s method and variations of the method to find speci</w:t>
@@ -215,7 +358,43 @@
         <w:t xml:space="preserve"> </w:t>
       </w:r>
       <w:r>
-        <w:t xml:space="preserve">nonlinear matrix equations like a quadratic matrix equation, a matrix polynomial equation, and an order-convex matrix equation. </w:t>
+        <w:t xml:space="preserve">nonlinear matrix equations </w:t>
+      </w:r>
+      <w:r>
+        <w:t>such as</w:t>
+      </w:r>
+      <w:r>
+        <w:t xml:space="preserve"> quadratic matrix equation</w:t>
+      </w:r>
+      <w:r>
+        <w:t>s</w:t>
+      </w:r>
+      <w:r>
+        <w:t>,</w:t>
+      </w:r>
+      <w:r>
+        <w:t xml:space="preserve"> </w:t>
+      </w:r>
+      <w:r>
+        <w:t>matrix polynomial equation</w:t>
+      </w:r>
+      <w:r>
+        <w:t>s</w:t>
+      </w:r>
+      <w:r>
+        <w:t xml:space="preserve">, </w:t>
+      </w:r>
+      <w:r>
+        <w:t>or</w:t>
+      </w:r>
+      <w:r>
+        <w:t xml:space="preserve"> order-convex matrix equation</w:t>
+      </w:r>
+      <w:r>
+        <w:t>s</w:t>
+      </w:r>
+      <w:r>
+        <w:t xml:space="preserve">. </w:t>
       </w:r>
       <w:r>
         <w:t>The goal</w:t>
@@ -232,6 +411,7 @@
         <w:rPr>
           <w:rFonts w:hint="eastAsia"/>
         </w:rPr>
+        <w:lastRenderedPageBreak/>
         <w:t>I</w:t>
       </w:r>
       <w:r>
@@ -241,8 +421,25 @@
         <w:t>-</w:t>
       </w:r>
       <w:r>
-        <w:lastRenderedPageBreak/>
-        <w:t>point iteration method. My idea is to apply this technique solving matrix polynomial equations with Newton’s method</w:t>
+        <w:t>point iteration method. My idea is to apply this technique</w:t>
+      </w:r>
+      <w:r>
+        <w:t xml:space="preserve"> to</w:t>
+      </w:r>
+      <w:r>
+        <w:t xml:space="preserve"> solv</w:t>
+      </w:r>
+      <w:r>
+        <w:t>e</w:t>
+      </w:r>
+      <w:r>
+        <w:t xml:space="preserve"> matrix polynomial equations </w:t>
+      </w:r>
+      <w:r>
+        <w:t>using</w:t>
+      </w:r>
+      <w:r>
+        <w:t xml:space="preserve"> Newton’s method</w:t>
       </w:r>
       <w:r>
         <w:rPr>
@@ -282,29 +479,28 @@
     </w:p>
     <w:p>
       <w:r>
-        <w:t xml:space="preserve">I </w:t>
-      </w:r>
-      <w:del w:id="0" w:author="서상협" w:date="2022-11-28T15:41:00Z">
-        <w:r>
-          <w:delText>have been</w:delText>
-        </w:r>
-      </w:del>
-      <w:ins w:id="1" w:author="서상협" w:date="2022-11-28T15:41:00Z">
-        <w:r>
-          <w:t>was</w:t>
-        </w:r>
-      </w:ins>
-      <w:r>
-        <w:t xml:space="preserve"> </w:t>
-      </w:r>
-      <w:r>
-        <w:t xml:space="preserve">working on a project to build an </w:t>
-      </w:r>
-      <w:r>
-        <w:t>algorithm search</w:t>
-      </w:r>
-      <w:r>
-        <w:t>ing</w:t>
+        <w:t>While I was a postdoctoral researcher, I had a chance to lead</w:t>
+      </w:r>
+      <w:r>
+        <w:t xml:space="preserve"> </w:t>
+      </w:r>
+      <w:r>
+        <w:t>the</w:t>
+      </w:r>
+      <w:r>
+        <w:t xml:space="preserve"> project</w:t>
+      </w:r>
+      <w:r>
+        <w:t xml:space="preserve"> to build</w:t>
+      </w:r>
+      <w:r>
+        <w:t xml:space="preserve"> an </w:t>
+      </w:r>
+      <w:r>
+        <w:t xml:space="preserve">algorithm </w:t>
+      </w:r>
+      <w:r>
+        <w:t>to identify</w:t>
       </w:r>
       <w:r>
         <w:t xml:space="preserve"> </w:t>
@@ -325,7 +521,13 @@
         <w:t xml:space="preserve"> for trauma patients</w:t>
       </w:r>
       <w:r>
-        <w:t xml:space="preserve"> with </w:t>
+        <w:t xml:space="preserve"> </w:t>
+      </w:r>
+      <w:r>
+        <w:t>using</w:t>
+      </w:r>
+      <w:r>
+        <w:t xml:space="preserve"> </w:t>
       </w:r>
       <w:r>
         <w:t>l</w:t>
@@ -342,21 +544,14 @@
       <w:r>
         <w:t xml:space="preserve">the </w:t>
       </w:r>
-      <w:ins w:id="2" w:author="서상협" w:date="2022-11-28T15:21:00Z">
-        <w:r>
-          <w:t xml:space="preserve">cases of </w:t>
-        </w:r>
-      </w:ins>
-      <w:r>
-        <w:t>trauma patient</w:t>
-      </w:r>
-      <w:del w:id="3" w:author="서상협" w:date="2022-11-28T15:21:00Z">
-        <w:r>
-          <w:delText xml:space="preserve"> cases</w:delText>
-        </w:r>
-      </w:del>
-      <w:r>
-        <w:t xml:space="preserve">, </w:t>
+      <w:r>
+        <w:t xml:space="preserve">cases of </w:t>
+      </w:r>
+      <w:r>
+        <w:t xml:space="preserve">trauma patient, </w:t>
+      </w:r>
+      <w:r>
+        <w:t xml:space="preserve">having </w:t>
       </w:r>
       <w:r>
         <w:t>pneumothorax</w:t>
@@ -368,136 +563,105 @@
         <w:t>hemothorax</w:t>
       </w:r>
       <w:r>
-        <w:t xml:space="preserve"> in CT </w:t>
-      </w:r>
-      <w:del w:id="4" w:author="서상협" w:date="2022-11-28T15:21:00Z">
-        <w:r>
-          <w:delText xml:space="preserve">images </w:delText>
-        </w:r>
-      </w:del>
-      <w:r>
-        <w:t xml:space="preserve">does not always mean that they have lung diseases. The patients can have </w:t>
-      </w:r>
-      <w:del w:id="5" w:author="서상협" w:date="2022-11-28T15:29:00Z">
-        <w:r>
-          <w:delText>blood or air pocket</w:delText>
-        </w:r>
-      </w:del>
-      <w:ins w:id="6" w:author="서상협" w:date="2022-11-28T15:29:00Z">
-        <w:r>
-          <w:t xml:space="preserve">trapped air or </w:t>
-        </w:r>
-      </w:ins>
-      <w:ins w:id="7" w:author="서상협" w:date="2022-11-28T15:31:00Z">
-        <w:r>
-          <w:t>pooled blood</w:t>
-        </w:r>
-      </w:ins>
+        <w:t xml:space="preserve"> in CT does not always mean that they have lung diseases. The patients can have </w:t>
+      </w:r>
+      <w:r>
+        <w:t>trapped air or pooled blood</w:t>
+      </w:r>
       <w:r>
         <w:t xml:space="preserve"> in the thorax </w:t>
       </w:r>
-      <w:ins w:id="8" w:author="서상협" w:date="2022-11-28T15:36:00Z">
-        <w:r>
-          <w:t xml:space="preserve">from injury of orgran other than </w:t>
-        </w:r>
-      </w:ins>
-      <w:ins w:id="9" w:author="서상협" w:date="2022-11-28T15:37:00Z">
-        <w:r>
-          <w:t xml:space="preserve">the </w:t>
-        </w:r>
-      </w:ins>
-      <w:del w:id="10" w:author="서상협" w:date="2022-11-28T15:37:00Z">
-        <w:r>
-          <w:delText xml:space="preserve">with damages from organs not </w:delText>
-        </w:r>
-      </w:del>
+      <w:r>
+        <w:t xml:space="preserve">from injury of organ other than </w:t>
+      </w:r>
       <w:r>
         <w:t xml:space="preserve">lungs. </w:t>
       </w:r>
       <w:r>
-        <w:t xml:space="preserve">It is very important to </w:t>
-      </w:r>
-      <w:del w:id="11" w:author="서상협" w:date="2022-11-28T15:38:00Z">
-        <w:r>
-          <w:delText>d</w:delText>
-        </w:r>
-        <w:r>
-          <w:delText>iscern</w:delText>
-        </w:r>
-        <w:r>
-          <w:delText xml:space="preserve"> </w:delText>
-        </w:r>
-      </w:del>
-      <w:ins w:id="12" w:author="서상협" w:date="2022-11-28T15:38:00Z">
-        <w:r>
-          <w:t>distinguish</w:t>
-        </w:r>
-        <w:r>
-          <w:t xml:space="preserve"> </w:t>
-        </w:r>
-      </w:ins>
+        <w:t>On that account, i</w:t>
+      </w:r>
+      <w:r>
+        <w:t xml:space="preserve">t is </w:t>
+      </w:r>
+      <w:r>
+        <w:t xml:space="preserve">an </w:t>
+      </w:r>
+      <w:r>
+        <w:t>important</w:t>
+      </w:r>
+      <w:r>
+        <w:t xml:space="preserve"> issue to correctly judge</w:t>
+      </w:r>
+      <w:r>
+        <w:t xml:space="preserve"> </w:t>
+      </w:r>
+      <w:r>
+        <w:t>whether</w:t>
+      </w:r>
+      <w:r>
+        <w:t xml:space="preserve"> </w:t>
+      </w:r>
       <w:r>
         <w:t xml:space="preserve">the </w:t>
       </w:r>
-      <w:del w:id="13" w:author="서상협" w:date="2022-11-28T15:37:00Z">
-        <w:r>
-          <w:delText>blood or air pocket</w:delText>
-        </w:r>
-      </w:del>
-      <w:ins w:id="14" w:author="서상협" w:date="2022-11-28T15:37:00Z">
-        <w:r>
-          <w:t>t</w:t>
-        </w:r>
-      </w:ins>
-      <w:ins w:id="15" w:author="서상협" w:date="2022-11-28T15:38:00Z">
-        <w:r>
-          <w:t xml:space="preserve">rapped air or </w:t>
-        </w:r>
-      </w:ins>
-      <w:ins w:id="16" w:author="서상협" w:date="2022-11-28T15:39:00Z">
-        <w:r>
-          <w:t>th</w:t>
-        </w:r>
-      </w:ins>
-      <w:ins w:id="17" w:author="서상협" w:date="2022-11-28T15:40:00Z">
-        <w:r>
-          <w:t xml:space="preserve">e </w:t>
-        </w:r>
-      </w:ins>
-      <w:ins w:id="18" w:author="서상협" w:date="2022-11-28T15:38:00Z">
-        <w:r>
-          <w:t>pooled blood</w:t>
-        </w:r>
-      </w:ins>
-      <w:r>
-        <w:t xml:space="preserve"> </w:t>
-      </w:r>
-      <w:r>
-        <w:t xml:space="preserve">is from </w:t>
-      </w:r>
-      <w:ins w:id="19" w:author="서상협" w:date="2022-11-28T15:40:00Z">
-        <w:r>
-          <w:t>lung injury</w:t>
-        </w:r>
-      </w:ins>
-      <w:del w:id="20" w:author="서상협" w:date="2022-11-28T15:40:00Z">
-        <w:r>
-          <w:delText>damages from lungs</w:delText>
-        </w:r>
-      </w:del>
-      <w:r>
-        <w:t xml:space="preserve"> or not with only CT images.</w:t>
+      <w:r>
+        <w:t>trapped air or the pooled blood</w:t>
+      </w:r>
+      <w:r>
+        <w:t xml:space="preserve"> </w:t>
+      </w:r>
+      <w:r>
+        <w:t>is</w:t>
+      </w:r>
+      <w:r>
+        <w:t xml:space="preserve"> </w:t>
+      </w:r>
+      <w:r>
+        <w:t>originated from</w:t>
+      </w:r>
+      <w:r>
+        <w:t xml:space="preserve"> </w:t>
+      </w:r>
+      <w:r>
+        <w:t>lung injury</w:t>
+      </w:r>
+      <w:r>
+        <w:t xml:space="preserve"> or not </w:t>
+      </w:r>
+      <w:r>
+        <w:t>using</w:t>
+      </w:r>
+      <w:r>
+        <w:t xml:space="preserve"> CT images.</w:t>
       </w:r>
     </w:p>
     <w:p>
       <w:r>
-        <w:t xml:space="preserve">In the institute where I worked, I participated the projects developing </w:t>
+        <w:t>In the institute where I worked, I participated</w:t>
+      </w:r>
+      <w:r>
+        <w:t xml:space="preserve"> in</w:t>
+      </w:r>
+      <w:r>
+        <w:t xml:space="preserve"> the projects </w:t>
+      </w:r>
+      <w:r>
+        <w:t>to develop</w:t>
+      </w:r>
+      <w:r>
+        <w:t xml:space="preserve"> </w:t>
       </w:r>
       <w:r>
         <w:t xml:space="preserve">medical </w:t>
       </w:r>
       <w:r>
-        <w:t xml:space="preserve">image processing algorithms with </w:t>
+        <w:t xml:space="preserve">image processing algorithms </w:t>
+      </w:r>
+      <w:r>
+        <w:t>utilizing</w:t>
+      </w:r>
+      <w:r>
+        <w:t xml:space="preserve"> </w:t>
       </w:r>
       <w:r>
         <w:t>neural network model</w:t>
@@ -521,24 +685,17 @@
         <w:t>wa</w:t>
       </w:r>
       <w:r>
-        <w:t xml:space="preserve">s developing </w:t>
+        <w:t xml:space="preserve">s </w:t>
+      </w:r>
+      <w:r>
+        <w:t xml:space="preserve">to develop </w:t>
       </w:r>
       <w:r>
         <w:t xml:space="preserve">eye disease </w:t>
       </w:r>
-      <w:ins w:id="21" w:author="서상협" w:date="2022-11-28T15:46:00Z">
-        <w:r>
-          <w:t>diagnosis</w:t>
-        </w:r>
-      </w:ins>
-      <w:del w:id="22" w:author="서상협" w:date="2022-11-28T15:46:00Z">
-        <w:r>
-          <w:delText>distinguish</w:delText>
-        </w:r>
-        <w:r>
-          <w:delText>ing</w:delText>
-        </w:r>
-      </w:del>
+      <w:r>
+        <w:t>diagnosis</w:t>
+      </w:r>
       <w:r>
         <w:t xml:space="preserve"> algorithm with f</w:t>
       </w:r>
@@ -551,29 +708,18 @@
       <w:r>
         <w:t xml:space="preserve"> </w:t>
       </w:r>
-      <w:del w:id="23" w:author="서상협" w:date="2022-11-28T15:53:00Z">
-        <w:r>
-          <w:delText>At that time</w:delText>
-        </w:r>
-      </w:del>
-      <w:ins w:id="24" w:author="서상협" w:date="2022-11-28T15:53:00Z">
-        <w:r>
-          <w:t>Back then</w:t>
-        </w:r>
-      </w:ins>
+      <w:r>
+        <w:t>Back then</w:t>
+      </w:r>
       <w:r>
         <w:t xml:space="preserve">, </w:t>
       </w:r>
-      <w:del w:id="25" w:author="서상협" w:date="2022-11-28T15:47:00Z">
-        <w:r>
-          <w:delText>my role was to write</w:delText>
-        </w:r>
-      </w:del>
-      <w:ins w:id="26" w:author="서상협" w:date="2022-11-28T15:47:00Z">
-        <w:r>
-          <w:t>I wrote</w:t>
-        </w:r>
-      </w:ins>
+      <w:r>
+        <w:t xml:space="preserve">I </w:t>
+      </w:r>
+      <w:r>
+        <w:t>submitted</w:t>
+      </w:r>
       <w:r>
         <w:t xml:space="preserve"> </w:t>
       </w:r>
@@ -598,11 +744,9 @@
       <w:r>
         <w:t>eport</w:t>
       </w:r>
-      <w:ins w:id="27" w:author="서상협" w:date="2022-11-28T15:49:00Z">
-        <w:r>
-          <w:t xml:space="preserve"> for 2 years</w:t>
-        </w:r>
-      </w:ins>
+      <w:r>
+        <w:t xml:space="preserve"> for 2 years</w:t>
+      </w:r>
       <w:r>
         <w:t>.</w:t>
       </w:r>
@@ -622,62 +766,51 @@
         <w:t xml:space="preserve">s </w:t>
       </w:r>
       <w:r>
-        <w:t xml:space="preserve">developing tooth numbering algorithm </w:t>
-      </w:r>
-      <w:del w:id="28" w:author="서상협" w:date="2022-11-28T15:53:00Z">
-        <w:r>
-          <w:delText xml:space="preserve">from mobile </w:delText>
-        </w:r>
-      </w:del>
-      <w:ins w:id="29" w:author="서상협" w:date="2022-11-28T15:54:00Z">
-        <w:r>
-          <w:t xml:space="preserve">with </w:t>
-        </w:r>
-      </w:ins>
+        <w:t>to develop</w:t>
+      </w:r>
+      <w:r>
+        <w:t xml:space="preserve"> tooth numbering algorithm </w:t>
+      </w:r>
+      <w:r>
+        <w:t xml:space="preserve">with </w:t>
+      </w:r>
       <w:r>
         <w:t>dental photos</w:t>
       </w:r>
-      <w:ins w:id="30" w:author="서상협" w:date="2022-11-28T15:53:00Z">
-        <w:r>
-          <w:t xml:space="preserve"> </w:t>
-        </w:r>
-        <w:r>
-          <w:t>from mobile</w:t>
-        </w:r>
-      </w:ins>
-      <w:ins w:id="31" w:author="서상협" w:date="2022-11-28T15:54:00Z">
-        <w:r>
-          <w:t xml:space="preserve"> devices</w:t>
-        </w:r>
-      </w:ins>
+      <w:r>
+        <w:t xml:space="preserve"> </w:t>
+      </w:r>
+      <w:r>
+        <w:t xml:space="preserve">taken </w:t>
+      </w:r>
+      <w:r>
+        <w:t>from mobile devices</w:t>
+      </w:r>
       <w:r>
         <w:t xml:space="preserve">. In the project, I </w:t>
       </w:r>
-      <w:del w:id="32" w:author="서상협" w:date="2022-11-28T15:54:00Z">
-        <w:r>
-          <w:delText xml:space="preserve">constructed </w:delText>
-        </w:r>
-      </w:del>
-      <w:ins w:id="33" w:author="서상협" w:date="2022-11-28T15:54:00Z">
-        <w:r>
-          <w:t xml:space="preserve">developed </w:t>
-        </w:r>
-      </w:ins>
-      <w:r>
-        <w:t xml:space="preserve">two segmentation neural network models from a </w:t>
-      </w:r>
-      <w:del w:id="34" w:author="서상협" w:date="2022-11-28T15:55:00Z">
-        <w:r>
-          <w:delText xml:space="preserve">modified </w:delText>
-        </w:r>
-      </w:del>
-      <w:ins w:id="35" w:author="서상협" w:date="2022-11-28T15:55:00Z">
-        <w:r>
-          <w:t xml:space="preserve">customized </w:t>
-        </w:r>
-      </w:ins>
-      <w:r>
-        <w:t xml:space="preserve">EfficientNet model and the U-net model. </w:t>
+      <w:r>
+        <w:t xml:space="preserve">developed </w:t>
+      </w:r>
+      <w:r>
+        <w:t xml:space="preserve">two segmentation neural network models </w:t>
+      </w:r>
+      <w:r>
+        <w:t>of</w:t>
+      </w:r>
+      <w:r>
+        <w:t xml:space="preserve"> </w:t>
+      </w:r>
+      <w:r>
+        <w:t xml:space="preserve">customized </w:t>
+      </w:r>
+      <w:proofErr w:type="spellStart"/>
+      <w:r>
+        <w:t>EfficientNet</w:t>
+      </w:r>
+      <w:proofErr w:type="spellEnd"/>
+      <w:r>
+        <w:t xml:space="preserve"> model and the U-net model.</w:t>
       </w:r>
     </w:p>
     <w:p>
@@ -693,20 +826,58 @@
       <w:r>
         <w:t>e</w:t>
       </w:r>
-      <w:r>
-        <w:t xml:space="preserve"> </w:t>
-      </w:r>
-      <w:r>
-        <w:t>experiences</w:t>
-      </w:r>
-      <w:r>
-        <w:t xml:space="preserve">, I applied </w:t>
+      <w:ins w:id="0" w:author="Kyeongah Nah" w:date="2022-11-29T10:04:00Z">
+        <w:r>
+          <w:t xml:space="preserve"> works</w:t>
+        </w:r>
+      </w:ins>
+      <w:del w:id="1" w:author="Kyeongah Nah" w:date="2022-11-29T10:04:00Z">
+        <w:r>
+          <w:delText xml:space="preserve"> </w:delText>
+        </w:r>
+        <w:r>
+          <w:delText>experiences</w:delText>
+        </w:r>
+      </w:del>
+      <w:r>
+        <w:t>, I</w:t>
+      </w:r>
+      <w:ins w:id="2" w:author="Kyeongah Nah" w:date="2022-11-29T10:05:00Z">
+        <w:r>
+          <w:t xml:space="preserve"> ex</w:t>
+        </w:r>
+      </w:ins>
+      <w:ins w:id="3" w:author="Kyeongah Nah" w:date="2022-11-29T10:06:00Z">
+        <w:r>
+          <w:t xml:space="preserve">perienced </w:t>
+        </w:r>
+      </w:ins>
+      <w:ins w:id="4" w:author="Kyeongah Nah" w:date="2022-11-29T14:45:00Z">
+        <w:r>
+          <w:t xml:space="preserve">the </w:t>
+        </w:r>
+      </w:ins>
+      <w:ins w:id="5" w:author="Kyeongah Nah" w:date="2022-11-29T10:06:00Z">
+        <w:r>
+          <w:t>application of</w:t>
+        </w:r>
+      </w:ins>
+      <w:del w:id="6" w:author="Kyeongah Nah" w:date="2022-11-29T10:05:00Z">
+        <w:r>
+          <w:delText xml:space="preserve"> applied</w:delText>
+        </w:r>
+      </w:del>
+      <w:r>
+        <w:t xml:space="preserve"> </w:t>
       </w:r>
       <w:r>
         <w:t xml:space="preserve">3D filtering techniques </w:t>
       </w:r>
       <w:r>
-        <w:t xml:space="preserve">to </w:t>
+        <w:t>for</w:t>
+      </w:r>
+      <w:r>
+        <w:t xml:space="preserve"> </w:t>
       </w:r>
       <w:r>
         <w:t xml:space="preserve">the volume </w:t>
@@ -724,142 +895,210 @@
         <w:t xml:space="preserve">the </w:t>
       </w:r>
       <w:r>
-        <w:t xml:space="preserve">pneumothorax and hemothorax from </w:t>
-      </w:r>
-      <w:ins w:id="36" w:author="서상협" w:date="2022-11-28T15:56:00Z">
-        <w:r>
-          <w:t>injury of organ other than the</w:t>
+        <w:t xml:space="preserve">pneumothorax and hemothorax </w:t>
+      </w:r>
+      <w:ins w:id="7" w:author="Kyeongah Nah" w:date="2022-11-29T14:46:00Z">
+        <w:r>
+          <w:t xml:space="preserve">using lung CT data of </w:t>
         </w:r>
       </w:ins>
-      <w:del w:id="37" w:author="서상협" w:date="2022-11-28T15:57:00Z">
-        <w:r>
-          <w:delText>damages from organs not</w:delText>
+      <w:ins w:id="8" w:author="Kyeongah Nah" w:date="2022-11-29T14:47:00Z">
+        <w:r>
+          <w:t>the patients</w:t>
+        </w:r>
+      </w:ins>
+      <w:ins w:id="9" w:author="Kyeongah Nah" w:date="2022-11-29T14:46:00Z">
+        <w:r>
+          <w:t xml:space="preserve"> who have lung injuries and other</w:t>
+        </w:r>
+      </w:ins>
+      <w:ins w:id="10" w:author="Kyeongah Nah" w:date="2022-11-29T14:47:00Z">
+        <w:r>
+          <w:t xml:space="preserve"> patients</w:t>
+        </w:r>
+      </w:ins>
+      <w:ins w:id="11" w:author="Kyeongah Nah" w:date="2022-11-29T14:46:00Z">
+        <w:r>
+          <w:t xml:space="preserve"> who have injuries in other or</w:t>
+        </w:r>
+      </w:ins>
+      <w:ins w:id="12" w:author="Kyeongah Nah" w:date="2022-11-29T14:47:00Z">
+        <w:r>
+          <w:t>gans</w:t>
+        </w:r>
+      </w:ins>
+      <w:del w:id="13" w:author="Kyeongah Nah" w:date="2022-11-29T14:46:00Z">
+        <w:r>
+          <w:delText>from</w:delText>
         </w:r>
       </w:del>
-      <w:r>
-        <w:t xml:space="preserve"> lungs</w:t>
-      </w:r>
-      <w:r>
-        <w:t xml:space="preserve"> with the lung CT data</w:t>
-      </w:r>
+      <w:del w:id="14" w:author="Kyeongah Nah" w:date="2022-11-29T14:47:00Z">
+        <w:r>
+          <w:delText xml:space="preserve"> </w:delText>
+        </w:r>
+        <w:r>
+          <w:delText>injury of organ other than the</w:delText>
+        </w:r>
+        <w:r>
+          <w:delText>damages from organs not lungs</w:delText>
+        </w:r>
+        <w:r>
+          <w:delText xml:space="preserve"> with the lung CT data</w:delText>
+        </w:r>
+      </w:del>
       <w:r>
         <w:t xml:space="preserve">. </w:t>
       </w:r>
-      <w:ins w:id="38" w:author="서상협" w:date="2022-11-28T15:57:00Z">
-        <w:r>
-          <w:t xml:space="preserve">Applying the techniques, </w:t>
+      <w:r>
+        <w:t xml:space="preserve">Applying </w:t>
+      </w:r>
+      <w:ins w:id="15" w:author="Kyeongah Nah" w:date="2022-11-29T14:56:00Z">
+        <w:r>
+          <w:t xml:space="preserve">3D </w:t>
         </w:r>
       </w:ins>
-      <w:ins w:id="39" w:author="서상협" w:date="2022-11-28T16:43:00Z">
-        <w:r>
-          <w:t xml:space="preserve">the algorithm </w:t>
-        </w:r>
+      <w:ins w:id="16" w:author="서상협" w:date="2022-11-28T15:57:00Z">
+        <w:del w:id="17" w:author="Kyeongah Nah" w:date="2022-11-29T14:56:00Z">
+          <w:r>
+            <w:delText>the</w:delText>
+          </w:r>
+        </w:del>
       </w:ins>
-      <w:ins w:id="40" w:author="서상협" w:date="2022-11-28T16:50:00Z">
-        <w:r>
-          <w:t xml:space="preserve">can </w:t>
+      <w:proofErr w:type="spellStart"/>
+      <w:ins w:id="18" w:author="Kyeongah Nah" w:date="2022-11-29T14:56:00Z">
+        <w:r>
+          <w:t>flitering</w:t>
         </w:r>
       </w:ins>
-      <w:ins w:id="41" w:author="서상협" w:date="2022-11-28T16:51:00Z">
-        <w:r>
-          <w:t>distinguish</w:t>
-        </w:r>
+      <w:proofErr w:type="spellEnd"/>
+      <w:r>
+        <w:t xml:space="preserve"> techniques, </w:t>
+      </w:r>
+      <w:r>
+        <w:t xml:space="preserve">the algorithm </w:t>
+      </w:r>
+      <w:r>
+        <w:t>successfully distinguished</w:t>
+      </w:r>
+      <w:r>
+        <w:t xml:space="preserve"> pneumothorax and hemothorax </w:t>
+      </w:r>
+      <w:r>
+        <w:t xml:space="preserve">caused by </w:t>
+      </w:r>
+      <w:ins w:id="19" w:author="서상협" w:date="2022-11-28T16:52:00Z">
+        <w:del w:id="20" w:author="Kyeongah Nah" w:date="2022-11-29T14:49:00Z">
+          <w:r>
+            <w:delText xml:space="preserve">between </w:delText>
+          </w:r>
+        </w:del>
       </w:ins>
-      <w:ins w:id="42" w:author="서상협" w:date="2022-11-28T16:43:00Z">
-        <w:r>
-          <w:t xml:space="preserve"> </w:t>
+      <w:ins w:id="21" w:author="서상협" w:date="2022-11-28T16:44:00Z">
+        <w:del w:id="22" w:author="Kyeongah Nah" w:date="2022-11-29T14:53:00Z">
+          <w:r>
+            <w:delText xml:space="preserve">from </w:delText>
+          </w:r>
+        </w:del>
+        <w:r>
+          <w:t xml:space="preserve">lung injury </w:t>
         </w:r>
       </w:ins>
-      <w:ins w:id="43" w:author="서상협" w:date="2022-11-28T16:44:00Z">
-        <w:r>
-          <w:t xml:space="preserve">the pneumothorax and hemothorax </w:t>
+      <w:ins w:id="23" w:author="Kyeongah Nah" w:date="2022-11-29T14:51:00Z">
+        <w:r>
+          <w:t>from</w:t>
         </w:r>
       </w:ins>
-      <w:ins w:id="44" w:author="서상협" w:date="2022-11-28T16:52:00Z">
-        <w:r>
-          <w:t xml:space="preserve">between </w:t>
-        </w:r>
+      <w:ins w:id="24" w:author="서상협" w:date="2022-11-28T16:52:00Z">
+        <w:del w:id="25" w:author="Kyeongah Nah" w:date="2022-11-29T14:51:00Z">
+          <w:r>
+            <w:delText>an</w:delText>
+          </w:r>
+        </w:del>
       </w:ins>
-      <w:ins w:id="45" w:author="서상협" w:date="2022-11-28T16:44:00Z">
-        <w:r>
-          <w:t xml:space="preserve">from </w:t>
-        </w:r>
-        <w:r>
-          <w:t xml:space="preserve">lung </w:t>
-        </w:r>
-        <w:r>
-          <w:t xml:space="preserve">injury </w:t>
+      <w:ins w:id="26" w:author="Kyeongah Nah" w:date="2022-11-29T14:55:00Z">
+        <w:r>
+          <w:t xml:space="preserve"> th</w:t>
         </w:r>
       </w:ins>
-      <w:ins w:id="46" w:author="서상협" w:date="2022-11-28T16:52:00Z">
-        <w:r>
-          <w:t>and injury to organs other than the lungs</w:t>
+      <w:ins w:id="27" w:author="Kyeongah Nah" w:date="2022-11-29T14:56:00Z">
+        <w:r>
+          <w:t>ose which was</w:t>
         </w:r>
       </w:ins>
-      <w:ins w:id="47" w:author="서상협" w:date="2022-11-28T16:44:00Z">
+      <w:ins w:id="28" w:author="서상협" w:date="2022-11-28T16:52:00Z">
+        <w:del w:id="29" w:author="Kyeongah Nah" w:date="2022-11-29T14:51:00Z">
+          <w:r>
+            <w:delText>d</w:delText>
+          </w:r>
+        </w:del>
+        <w:del w:id="30" w:author="Kyeongah Nah" w:date="2022-11-29T14:55:00Z">
+          <w:r>
+            <w:delText xml:space="preserve"> </w:delText>
+          </w:r>
+        </w:del>
+      </w:ins>
+      <w:ins w:id="31" w:author="Kyeongah Nah" w:date="2022-11-29T14:54:00Z">
+        <w:r>
+          <w:t xml:space="preserve"> brought by </w:t>
+        </w:r>
+      </w:ins>
+      <w:ins w:id="32" w:author="서상협" w:date="2022-11-28T16:52:00Z">
+        <w:del w:id="33" w:author="Kyeongah Nah" w:date="2022-11-29T14:53:00Z">
+          <w:r>
+            <w:delText>injury to organs other than the lungs</w:delText>
+          </w:r>
+        </w:del>
+      </w:ins>
+      <w:ins w:id="34" w:author="Kyeongah Nah" w:date="2022-11-29T14:53:00Z">
+        <w:r>
+          <w:t>other i</w:t>
+        </w:r>
+      </w:ins>
+      <w:ins w:id="35" w:author="Kyeongah Nah" w:date="2022-11-29T14:54:00Z">
+        <w:r>
+          <w:t>njuries</w:t>
+        </w:r>
+      </w:ins>
+      <w:ins w:id="36" w:author="서상협" w:date="2022-11-28T16:44:00Z">
         <w:r>
           <w:t xml:space="preserve">. </w:t>
         </w:r>
       </w:ins>
       <w:r>
-        <w:t xml:space="preserve">My coauthors </w:t>
-      </w:r>
-      <w:del w:id="48" w:author="서상협" w:date="2022-11-28T16:40:00Z">
-        <w:r>
-          <w:delText>in the hospital</w:delText>
-        </w:r>
-      </w:del>
-      <w:ins w:id="49" w:author="서상협" w:date="2022-11-28T16:40:00Z">
-        <w:r>
-          <w:t>?</w:t>
-        </w:r>
-      </w:ins>
-      <w:r>
-        <w:t xml:space="preserve"> </w:t>
-      </w:r>
-      <w:del w:id="50" w:author="서상협" w:date="2022-11-28T16:41:00Z">
-        <w:r>
-          <w:delText xml:space="preserve">is comparing </w:delText>
-        </w:r>
-      </w:del>
-      <w:ins w:id="51" w:author="서상협" w:date="2022-11-28T16:41:00Z">
-        <w:r>
-          <w:t>compar</w:t>
-        </w:r>
-        <w:r>
-          <w:t>ed</w:t>
-        </w:r>
-        <w:r>
-          <w:t xml:space="preserve"> </w:t>
-        </w:r>
-      </w:ins>
-      <w:r>
-        <w:t xml:space="preserve">with the clinical data. </w:t>
-      </w:r>
-      <w:r>
-        <w:t xml:space="preserve">This work is </w:t>
-      </w:r>
-      <w:r>
-        <w:t xml:space="preserve">almost </w:t>
-      </w:r>
-      <w:del w:id="52" w:author="서상협" w:date="2022-11-28T16:41:00Z">
-        <w:r>
-          <w:delText xml:space="preserve">in the process </w:delText>
-        </w:r>
-        <w:r>
-          <w:delText>finishing</w:delText>
-        </w:r>
-      </w:del>
-      <w:ins w:id="53" w:author="서상협" w:date="2022-11-28T16:41:00Z">
-        <w:r>
-          <w:t>done</w:t>
-        </w:r>
-      </w:ins>
-      <w:r>
-        <w:t>.</w:t>
+        <w:t>Currently t</w:t>
+      </w:r>
+      <w:r>
+        <w:t>he work</w:t>
+      </w:r>
+      <w:r>
+        <w:t xml:space="preserve"> </w:t>
+      </w:r>
+      <w:r>
+        <w:t xml:space="preserve">is in </w:t>
+      </w:r>
+      <w:r>
+        <w:t xml:space="preserve">its </w:t>
+      </w:r>
+      <w:r>
+        <w:t>final stage and</w:t>
+      </w:r>
+      <w:r>
+        <w:t xml:space="preserve"> under the process of validation </w:t>
+      </w:r>
+      <w:r>
+        <w:t xml:space="preserve">conducted </w:t>
+      </w:r>
+      <w:r>
+        <w:t>by medical experts.</w:t>
       </w:r>
     </w:p>
-    <w:p/>
+    <w:p>
+      <w:pPr>
+        <w:rPr>
+          <w:del w:id="37" w:author="상협 서" w:date="2022-11-29T17:02:00Z"/>
+        </w:rPr>
+      </w:pPr>
+    </w:p>
     <w:p>
       <w:pPr>
         <w:pStyle w:val="1"/>
@@ -868,6 +1107,7 @@
         <w:rPr>
           <w:rFonts w:hint="eastAsia"/>
         </w:rPr>
+        <w:lastRenderedPageBreak/>
         <w:t>F</w:t>
       </w:r>
       <w:r>
@@ -876,842 +1116,76 @@
     </w:p>
     <w:p>
       <w:r>
-        <w:t>Moving forward</w:t>
-      </w:r>
-      <w:r>
-        <w:t xml:space="preserve">, I </w:t>
-      </w:r>
-      <w:r>
-        <w:t>plan to deal with</w:t>
-      </w:r>
-      <w:r>
-        <w:t xml:space="preserve"> two </w:t>
-      </w:r>
-      <w:r>
-        <w:t xml:space="preserve">subjects. </w:t>
-      </w:r>
-      <w:r>
-        <w:t>T</w:t>
-      </w:r>
-      <w:r>
-        <w:t>he first subject</w:t>
-      </w:r>
-      <w:r>
-        <w:t xml:space="preserve"> is to </w:t>
-      </w:r>
-      <w:del w:id="54" w:author="서상협" w:date="2022-11-28T16:56:00Z">
-        <w:r>
-          <w:delText xml:space="preserve">suggest </w:delText>
-        </w:r>
-      </w:del>
-      <w:ins w:id="55" w:author="서상협" w:date="2022-11-28T16:56:00Z">
-        <w:r>
-          <w:t xml:space="preserve">develop </w:t>
-        </w:r>
-      </w:ins>
-      <w:r>
-        <w:t>various accelerated iterative method</w:t>
-      </w:r>
-      <w:r>
-        <w:t>, especially Newton’s method,</w:t>
-      </w:r>
-      <w:r>
-        <w:t xml:space="preserve"> solving nonlinear matrix equations.</w:t>
-      </w:r>
-      <w:r>
-        <w:t xml:space="preserve"> </w:t>
-      </w:r>
-      <w:ins w:id="56" w:author="서상협" w:date="2022-11-28T17:10:00Z">
-        <w:r>
-          <w:t xml:space="preserve">It is well known that </w:t>
-        </w:r>
-      </w:ins>
-      <w:ins w:id="57" w:author="서상협" w:date="2022-11-28T17:11:00Z">
-        <w:r>
-          <w:t xml:space="preserve">giving </w:t>
-        </w:r>
-        <w:r>
-          <w:t>appropriate</w:t>
-        </w:r>
-        <w:r>
-          <w:t xml:space="preserve"> scalar multiplication to the differences of each step</w:t>
-        </w:r>
-        <w:r>
-          <w:t xml:space="preserve"> is </w:t>
-        </w:r>
-      </w:ins>
-      <w:del w:id="58" w:author="서상협" w:date="2022-11-28T17:11:00Z">
-        <w:r>
-          <w:delText>A</w:delText>
-        </w:r>
-      </w:del>
-      <w:ins w:id="59" w:author="서상협" w:date="2022-11-28T17:11:00Z">
-        <w:r>
-          <w:t>a</w:t>
-        </w:r>
-      </w:ins>
-      <w:r>
-        <w:t xml:space="preserve"> representative </w:t>
-      </w:r>
-      <w:del w:id="60" w:author="서상협" w:date="2022-11-28T17:11:00Z">
-        <w:r>
-          <w:delText xml:space="preserve">method </w:delText>
-        </w:r>
-      </w:del>
-      <w:ins w:id="61" w:author="서상협" w:date="2022-11-28T17:11:00Z">
-        <w:r>
-          <w:t>tech</w:t>
-        </w:r>
-      </w:ins>
-      <w:ins w:id="62" w:author="서상협" w:date="2022-11-28T17:12:00Z">
-        <w:r>
-          <w:t xml:space="preserve">nique </w:t>
-        </w:r>
-      </w:ins>
-      <w:r>
-        <w:t xml:space="preserve">to accelerate Newton’s </w:t>
-      </w:r>
-      <w:r>
-        <w:lastRenderedPageBreak/>
-        <w:t>method</w:t>
-      </w:r>
-      <w:del w:id="63" w:author="서상협" w:date="2022-11-28T17:12:00Z">
-        <w:r>
-          <w:delText xml:space="preserve"> is</w:delText>
-        </w:r>
-      </w:del>
-      <w:del w:id="64" w:author="서상협" w:date="2022-11-28T17:11:00Z">
-        <w:r>
-          <w:delText xml:space="preserve"> </w:delText>
-        </w:r>
-        <w:r>
-          <w:delText xml:space="preserve">giving </w:delText>
-        </w:r>
-        <w:r>
-          <w:delText>appropriate</w:delText>
-        </w:r>
-        <w:r>
-          <w:delText xml:space="preserve"> scalar multiplication </w:delText>
-        </w:r>
-        <w:r>
-          <w:delText>to the differences of each steps</w:delText>
-        </w:r>
-      </w:del>
-      <w:r>
-        <w:t>.</w:t>
-      </w:r>
-      <w:r>
-        <w:t xml:space="preserve"> </w:t>
-      </w:r>
-      <w:r>
-        <w:t xml:space="preserve">One of </w:t>
-      </w:r>
-      <w:del w:id="65" w:author="서상협" w:date="2022-11-28T17:13:00Z">
-        <w:r>
-          <w:delText xml:space="preserve">methods </w:delText>
-        </w:r>
-      </w:del>
-      <w:ins w:id="66" w:author="서상협" w:date="2022-11-28T17:13:00Z">
-        <w:r>
-          <w:t>the technique</w:t>
-        </w:r>
-        <w:r>
-          <w:t xml:space="preserve">s </w:t>
-        </w:r>
-      </w:ins>
-      <w:r>
-        <w:t xml:space="preserve">finding the appropriate scalar </w:t>
-      </w:r>
-      <w:r>
-        <w:t xml:space="preserve">is </w:t>
-      </w:r>
-      <w:r>
-        <w:t xml:space="preserve">exact line searches. </w:t>
-      </w:r>
-      <w:r>
-        <w:t xml:space="preserve">A disadvantage of exact line searches is that it </w:t>
-      </w:r>
-      <w:del w:id="67" w:author="서상협" w:date="2022-11-28T17:14:00Z">
-        <w:r>
-          <w:delText xml:space="preserve">takes </w:delText>
-        </w:r>
-      </w:del>
-      <w:ins w:id="68" w:author="서상협" w:date="2022-11-28T17:14:00Z">
-        <w:r>
-          <w:t>require</w:t>
-        </w:r>
-        <w:r>
-          <w:t xml:space="preserve">s </w:t>
-        </w:r>
-      </w:ins>
-      <w:r>
-        <w:t xml:space="preserve">too </w:t>
-      </w:r>
-      <w:del w:id="69" w:author="서상협" w:date="2022-11-28T17:14:00Z">
-        <w:r>
-          <w:delText xml:space="preserve">much </w:delText>
-        </w:r>
-      </w:del>
-      <w:ins w:id="70" w:author="서상협" w:date="2022-11-28T17:14:00Z">
-        <w:r>
-          <w:t xml:space="preserve">many </w:t>
-        </w:r>
-      </w:ins>
-      <w:del w:id="71" w:author="서상협" w:date="2022-11-28T17:15:00Z">
-        <w:r>
-          <w:delText xml:space="preserve">calculation </w:delText>
-        </w:r>
-      </w:del>
-      <w:ins w:id="72" w:author="서상협" w:date="2022-11-28T17:15:00Z">
-        <w:r>
-          <w:t xml:space="preserve">computing </w:t>
-        </w:r>
-      </w:ins>
-      <w:r>
-        <w:t xml:space="preserve">resources. </w:t>
-      </w:r>
-      <w:r>
-        <w:t>On the other hand</w:t>
-      </w:r>
-      <w:r>
-        <w:t xml:space="preserve">, in </w:t>
-      </w:r>
-      <w:ins w:id="73" w:author="서상협" w:date="2022-11-28T17:18:00Z">
-        <w:r>
-          <w:t xml:space="preserve">the </w:t>
-        </w:r>
-      </w:ins>
-      <w:r>
-        <w:t xml:space="preserve">mathematical sense, </w:t>
-      </w:r>
-      <w:ins w:id="74" w:author="서상협" w:date="2022-11-28T17:35:00Z">
-        <w:r>
-          <w:t xml:space="preserve">there is an advantage that </w:t>
-        </w:r>
-      </w:ins>
-      <w:r>
-        <w:t xml:space="preserve">it gives the most appropriate next step for each iteration. </w:t>
-      </w:r>
-      <w:r>
-        <w:t xml:space="preserve">Moreover, </w:t>
-      </w:r>
-      <w:moveToRangeStart w:id="75" w:author="서상협" w:date="2022-11-28T17:23:00Z" w:name="move120548651"/>
-      <w:moveTo w:id="76" w:author="서상협" w:date="2022-11-28T17:23:00Z">
-        <w:del w:id="77" w:author="서상협" w:date="2022-11-28T17:24:00Z">
-          <w:r>
-            <w:delText>from</w:delText>
-          </w:r>
-        </w:del>
-      </w:moveTo>
-      <w:ins w:id="78" w:author="서상협" w:date="2022-11-28T17:24:00Z">
-        <w:r>
-          <w:t>with</w:t>
-        </w:r>
-      </w:ins>
-      <w:moveTo w:id="79" w:author="서상협" w:date="2022-11-28T17:23:00Z">
-        <w:r>
-          <w:t xml:space="preserve"> many experiments</w:t>
-        </w:r>
-        <w:del w:id="80" w:author="서상협" w:date="2022-11-28T17:24:00Z">
-          <w:r>
-            <w:delText>.</w:delText>
-          </w:r>
-        </w:del>
-      </w:moveTo>
-      <w:moveToRangeEnd w:id="75"/>
-      <w:ins w:id="81" w:author="서상협" w:date="2022-11-28T17:24:00Z">
-        <w:r>
-          <w:t xml:space="preserve">, </w:t>
-        </w:r>
-      </w:ins>
-      <w:del w:id="82" w:author="서상협" w:date="2022-11-28T17:23:00Z">
-        <w:r>
-          <w:delText xml:space="preserve">for Newton’s method, </w:delText>
-        </w:r>
-      </w:del>
-      <w:ins w:id="83" w:author="서상협" w:date="2022-11-28T17:24:00Z">
-        <w:r>
-          <w:t xml:space="preserve">I guess that </w:t>
-        </w:r>
-      </w:ins>
-      <w:r>
-        <w:t xml:space="preserve">there is a tendency that </w:t>
-      </w:r>
-      <w:del w:id="84" w:author="서상협" w:date="2022-11-28T17:22:00Z">
-        <w:r>
-          <w:delText xml:space="preserve">each </w:delText>
-        </w:r>
-      </w:del>
-      <w:ins w:id="85" w:author="서상협" w:date="2022-11-28T17:22:00Z">
-        <w:r>
-          <w:t xml:space="preserve">the sequence of </w:t>
-        </w:r>
-      </w:ins>
-      <w:r>
-        <w:t>difference</w:t>
-      </w:r>
-      <w:ins w:id="86" w:author="서상협" w:date="2022-11-28T17:22:00Z">
-        <w:r>
-          <w:t>s</w:t>
-        </w:r>
-      </w:ins>
-      <w:r>
-        <w:t xml:space="preserve"> </w:t>
-      </w:r>
-      <w:ins w:id="87" w:author="서상협" w:date="2022-11-28T17:20:00Z">
-        <w:r>
-          <w:t xml:space="preserve">between </w:t>
-        </w:r>
-      </w:ins>
-      <w:del w:id="88" w:author="서상협" w:date="2022-11-28T17:21:00Z">
-        <w:r>
-          <w:delText xml:space="preserve">of </w:delText>
-        </w:r>
-      </w:del>
-      <w:r>
-        <w:t xml:space="preserve">each </w:t>
-      </w:r>
-      <w:ins w:id="89" w:author="서상협" w:date="2022-11-28T17:23:00Z">
-        <w:r>
-          <w:t xml:space="preserve">Newton </w:t>
-        </w:r>
-      </w:ins>
-      <w:r>
-        <w:t>step converges to a one-dimensional space</w:t>
-      </w:r>
-      <w:ins w:id="90" w:author="서상협" w:date="2022-11-28T17:23:00Z">
-        <w:r>
-          <w:t>.</w:t>
-        </w:r>
-      </w:ins>
-      <w:moveFromRangeStart w:id="91" w:author="서상협" w:date="2022-11-28T17:23:00Z" w:name="move120548651"/>
-      <w:moveFrom w:id="92" w:author="서상협" w:date="2022-11-28T17:23:00Z">
-        <w:r>
-          <w:t xml:space="preserve"> from many experiments.</w:t>
-        </w:r>
-      </w:moveFrom>
-      <w:moveFromRangeEnd w:id="91"/>
-      <w:r>
-        <w:t xml:space="preserve"> So, I </w:t>
-      </w:r>
-      <w:del w:id="93" w:author="서상협" w:date="2022-11-28T17:25:00Z">
-        <w:r>
-          <w:delText xml:space="preserve">will </w:delText>
-        </w:r>
-      </w:del>
-      <w:ins w:id="94" w:author="서상협" w:date="2022-11-28T17:25:00Z">
-        <w:r>
-          <w:t xml:space="preserve">plan to </w:t>
-        </w:r>
-      </w:ins>
-      <w:r>
-        <w:t xml:space="preserve">give a proof of the tendency and </w:t>
-      </w:r>
-      <w:ins w:id="95" w:author="서상협" w:date="2022-11-28T17:26:00Z">
-        <w:r>
-          <w:t xml:space="preserve">to </w:t>
-        </w:r>
-      </w:ins>
-      <w:r>
-        <w:t xml:space="preserve">show the efficiency of the </w:t>
-      </w:r>
-      <w:del w:id="96" w:author="서상협" w:date="2022-11-28T17:26:00Z">
-        <w:r>
-          <w:delText xml:space="preserve">method </w:delText>
-        </w:r>
-      </w:del>
-      <w:ins w:id="97" w:author="서상협" w:date="2022-11-28T17:26:00Z">
-        <w:r>
-          <w:t xml:space="preserve">technique </w:t>
-        </w:r>
-      </w:ins>
-      <w:r>
-        <w:t>which applies only one time of exact line searches</w:t>
-      </w:r>
-      <w:ins w:id="98" w:author="서상협" w:date="2022-11-28T17:28:00Z">
-        <w:r>
-          <w:t xml:space="preserve"> on </w:t>
-        </w:r>
-      </w:ins>
-      <w:ins w:id="99" w:author="서상협" w:date="2022-11-28T17:29:00Z">
-        <w:r>
-          <w:t>middle part of existing Newton sequence</w:t>
-        </w:r>
-      </w:ins>
-      <w:r>
-        <w:t>.</w:t>
+        <w:t xml:space="preserve">Moving forward, I plan to deal with two subjects. The first subject is to develop various accelerated iterative method, especially Newton’s method to solve nonlinear matrix equations. A well-known strategy in the acceleration of Newton’s method is giving </w:t>
+      </w:r>
+      <w:r>
+        <w:t>appropriate</w:t>
+      </w:r>
+      <w:r>
+        <w:t xml:space="preserve"> scalar multiplication to the differences of each step. To find the appropriate scalar, the technique of exact line search can be used. A disadvantage of exact line searches is in that it requires too many computing resources. On the other hand, in mathematical sense, there is an advantage that it gives the most appropriate next step for each iteration. Going through several simulation experiments, I gained an insight that there is a tendency that the sequence of differences between each Newton step converges to a one-dimensional space. As a next step, I plan to give a proof of the tendency and show the efficiency of the technique which applies only one time of exact line searches on the middle part of existing Newton sequence.</w:t>
       </w:r>
     </w:p>
     <w:p>
       <w:r>
-        <w:t xml:space="preserve">It is the second subject to study </w:t>
-      </w:r>
-      <w:r>
-        <w:t xml:space="preserve">about </w:t>
-      </w:r>
-      <w:r>
-        <w:t xml:space="preserve">deep learning models </w:t>
-      </w:r>
-      <w:r>
-        <w:t xml:space="preserve">and apply them </w:t>
-      </w:r>
-      <w:r>
-        <w:t xml:space="preserve">to </w:t>
-      </w:r>
-      <w:r>
-        <w:t>applied</w:t>
-      </w:r>
-      <w:r>
-        <w:t xml:space="preserve"> problems. </w:t>
-      </w:r>
-      <w:r>
-        <w:t xml:space="preserve">In the institute where I worked, almost of my missions were applying deep learning models for processing medical images. So, I </w:t>
-      </w:r>
-      <w:del w:id="100" w:author="서상협" w:date="2022-11-28T17:31:00Z">
-        <w:r>
-          <w:delText xml:space="preserve">have </w:delText>
-        </w:r>
-      </w:del>
-      <w:r>
-        <w:t>dealt with</w:t>
-      </w:r>
-      <w:r>
-        <w:t xml:space="preserve"> </w:t>
-      </w:r>
-      <w:r>
-        <w:t>many medical images like fundus, dental, and lung CT image</w:t>
-      </w:r>
-      <w:del w:id="101" w:author="서상협" w:date="2022-11-28T17:32:00Z">
-        <w:r>
-          <w:delText xml:space="preserve"> data</w:delText>
-        </w:r>
-      </w:del>
-      <w:ins w:id="102" w:author="서상협" w:date="2022-11-28T17:32:00Z">
-        <w:r>
-          <w:t>s</w:t>
-        </w:r>
-      </w:ins>
-      <w:r>
-        <w:t xml:space="preserve">. </w:t>
-      </w:r>
-      <w:r>
-        <w:t>But, I had less chances</w:t>
-      </w:r>
-      <w:r>
-        <w:t xml:space="preserve"> to </w:t>
-      </w:r>
-      <w:del w:id="103" w:author="서상협" w:date="2022-11-28T17:33:00Z">
-        <w:r>
-          <w:delText xml:space="preserve">deal with </w:delText>
-        </w:r>
-      </w:del>
-      <w:ins w:id="104" w:author="서상협" w:date="2022-11-28T17:33:00Z">
-        <w:r>
-          <w:t xml:space="preserve">process </w:t>
-        </w:r>
-      </w:ins>
-      <w:r>
-        <w:t xml:space="preserve">other data </w:t>
-      </w:r>
-      <w:del w:id="105" w:author="서상협" w:date="2022-11-28T17:33:00Z">
-        <w:r>
-          <w:delText>for example</w:delText>
-        </w:r>
-      </w:del>
-      <w:ins w:id="106" w:author="서상협" w:date="2022-11-28T17:33:00Z">
-        <w:r>
-          <w:t>like</w:t>
-        </w:r>
-      </w:ins>
-      <w:r>
-        <w:t xml:space="preserve"> language data. </w:t>
-      </w:r>
-      <w:del w:id="107" w:author="서상협" w:date="2022-11-28T17:34:00Z">
-        <w:r>
-          <w:delText>Especially</w:delText>
-        </w:r>
-      </w:del>
-      <w:ins w:id="108" w:author="서상협" w:date="2022-11-28T17:34:00Z">
-        <w:r>
-          <w:t>In particular</w:t>
-        </w:r>
-      </w:ins>
-      <w:r>
-        <w:t xml:space="preserve">, I want to </w:t>
-      </w:r>
-      <w:r>
-        <w:t>study</w:t>
-      </w:r>
-      <w:r>
-        <w:t xml:space="preserve"> a</w:t>
-      </w:r>
-      <w:r>
-        <w:t>bout</w:t>
-      </w:r>
-      <w:r>
-        <w:t xml:space="preserve"> language </w:t>
-      </w:r>
-      <w:r>
-        <w:t xml:space="preserve">processing </w:t>
-      </w:r>
-      <w:r>
-        <w:t>model</w:t>
-      </w:r>
-      <w:r>
-        <w:t>s</w:t>
-      </w:r>
-      <w:r>
-        <w:t xml:space="preserve"> for SOV</w:t>
-      </w:r>
-      <w:r>
-        <w:t>(Subject-Object-Verb)</w:t>
-      </w:r>
-      <w:r>
-        <w:t xml:space="preserve"> </w:t>
-      </w:r>
-      <w:del w:id="109" w:author="서상협" w:date="2022-11-28T17:34:00Z">
-        <w:r>
-          <w:delText xml:space="preserve">or </w:delText>
-        </w:r>
-      </w:del>
-      <w:ins w:id="110" w:author="서상협" w:date="2022-11-28T17:34:00Z">
-        <w:r>
-          <w:t>and</w:t>
-        </w:r>
-        <w:r>
-          <w:t xml:space="preserve"> </w:t>
-        </w:r>
-      </w:ins>
+        <w:t xml:space="preserve">As a second subject, I will keep studying deep learning models and exert them to tackle industrial problems. In the institute I previously worked, my task was to apply deep learning models to process medical images. Consequently, I dealt with various types of medical images like fundus, dental, and lung CT images. In a future, I wish to have a chance to process other types of data including language data. </w:t>
+      </w:r>
+      <w:proofErr w:type="gramStart"/>
+      <w:r>
+        <w:t>In particular, I</w:t>
+      </w:r>
+      <w:proofErr w:type="gramEnd"/>
+      <w:r>
+        <w:t xml:space="preserve"> would like to study language processing models for SOV(Subject-Object-Verb) and </w:t>
+      </w:r>
       <w:r>
         <w:t xml:space="preserve">agglutinative language like Korean language. </w:t>
       </w:r>
       <w:r>
-        <w:t xml:space="preserve">There are many </w:t>
-      </w:r>
-      <w:del w:id="111" w:author="서상협" w:date="2022-11-28T17:38:00Z">
-        <w:r>
-          <w:delText xml:space="preserve">advanced </w:delText>
-        </w:r>
-      </w:del>
-      <w:r>
-        <w:t>natural language process</w:t>
-      </w:r>
-      <w:ins w:id="112" w:author="서상협" w:date="2022-11-28T17:38:00Z">
-        <w:r>
-          <w:t>ing</w:t>
-        </w:r>
-      </w:ins>
-      <w:r>
-        <w:t xml:space="preserve"> algorithms for English. However, En</w:t>
-      </w:r>
-      <w:r>
-        <w:t xml:space="preserve">glish and Korean have different language structure and history. </w:t>
-      </w:r>
-      <w:r>
-        <w:t xml:space="preserve">So, I hope that I understand the differences of them and </w:t>
-      </w:r>
-      <w:ins w:id="113" w:author="서상협" w:date="2022-11-28T17:37:00Z">
-        <w:r>
-          <w:t xml:space="preserve">I </w:t>
-        </w:r>
-      </w:ins>
-      <w:del w:id="114" w:author="서상협" w:date="2022-11-28T17:37:00Z">
-        <w:r>
-          <w:delText xml:space="preserve">construct </w:delText>
-        </w:r>
-      </w:del>
-      <w:ins w:id="115" w:author="서상협" w:date="2022-11-28T17:37:00Z">
-        <w:r>
-          <w:t>develop</w:t>
-        </w:r>
-        <w:r>
-          <w:t xml:space="preserve"> </w:t>
-        </w:r>
-      </w:ins>
-      <w:r>
-        <w:t>a model which is fit to Korean.</w:t>
+        <w:t>Although t</w:t>
+      </w:r>
+      <w:r>
+        <w:t xml:space="preserve">here </w:t>
+      </w:r>
+      <w:r>
+        <w:t>exist</w:t>
+      </w:r>
+      <w:r>
+        <w:t xml:space="preserve"> many natural language process</w:t>
+      </w:r>
+      <w:r>
+        <w:t>ing</w:t>
+      </w:r>
+      <w:r>
+        <w:t xml:space="preserve"> algorithms for English,</w:t>
+      </w:r>
+      <w:r>
+        <w:t xml:space="preserve"> as </w:t>
+      </w:r>
+      <w:r>
+        <w:t>En</w:t>
+      </w:r>
+      <w:r>
+        <w:t>glish and Korean have different language structure and history, I wish to understand the difference of them and develop a model which fit to Korean.</w:t>
       </w:r>
     </w:p>
     <w:p>
-      <w:del w:id="116" w:author="서상협" w:date="2022-11-28T17:43:00Z">
-        <w:r>
-          <w:rPr>
-            <w:rFonts w:hint="eastAsia"/>
-          </w:rPr>
-          <w:delText>T</w:delText>
-        </w:r>
-        <w:r>
-          <w:delText xml:space="preserve">hrough previous two subjects, </w:delText>
-        </w:r>
-      </w:del>
-      <w:ins w:id="117" w:author="서상협" w:date="2022-11-28T17:43:00Z">
-        <w:r>
-          <w:t>?</w:t>
-        </w:r>
-      </w:ins>
-      <w:r>
-        <w:t>I will research about</w:t>
-      </w:r>
-      <w:del w:id="118" w:author="서상협" w:date="2022-11-28T17:49:00Z">
-        <w:r>
-          <w:delText xml:space="preserve"> </w:delText>
-        </w:r>
-        <w:r>
-          <w:delText xml:space="preserve">efficient </w:delText>
-        </w:r>
-        <w:r>
-          <w:delText>neural network models</w:delText>
-        </w:r>
-      </w:del>
-      <w:r>
-        <w:t xml:space="preserve"> finding solutions of various nonlinear matrix equations</w:t>
-      </w:r>
-      <w:ins w:id="119" w:author="서상협" w:date="2022-11-28T17:49:00Z">
-        <w:r>
-          <w:t xml:space="preserve"> with </w:t>
-        </w:r>
-        <w:r>
-          <w:t>neural network models</w:t>
-        </w:r>
-      </w:ins>
-      <w:r>
-        <w:t xml:space="preserve">. </w:t>
-      </w:r>
-      <w:del w:id="120" w:author="서상협" w:date="2022-11-28T17:46:00Z">
-        <w:r>
-          <w:delText>I</w:delText>
-        </w:r>
-        <w:r>
-          <w:delText>terative methods t</w:delText>
-        </w:r>
-      </w:del>
-      <w:ins w:id="121" w:author="서상협" w:date="2022-11-28T17:46:00Z">
-        <w:r>
-          <w:t>T</w:t>
-        </w:r>
-      </w:ins>
-      <w:r>
-        <w:t>o find solutions of nonlinear matrix equations</w:t>
-      </w:r>
-      <w:ins w:id="122" w:author="서상협" w:date="2022-11-28T17:46:00Z">
-        <w:r>
-          <w:t xml:space="preserve"> with iterative methods, we</w:t>
-        </w:r>
-      </w:ins>
-      <w:r>
-        <w:t xml:space="preserve"> </w:t>
-      </w:r>
-      <w:r>
-        <w:t>need</w:t>
-      </w:r>
-      <w:r>
-        <w:t xml:space="preserve"> a lot of </w:t>
-      </w:r>
-      <w:del w:id="123" w:author="서상협" w:date="2022-11-28T17:45:00Z">
-        <w:r>
-          <w:delText xml:space="preserve">calculation </w:delText>
-        </w:r>
-      </w:del>
-      <w:ins w:id="124" w:author="서상협" w:date="2022-11-28T17:45:00Z">
-        <w:r>
-          <w:t xml:space="preserve">computing </w:t>
-        </w:r>
-      </w:ins>
-      <w:r>
-        <w:t>resources.</w:t>
-      </w:r>
-      <w:r>
-        <w:t xml:space="preserve"> </w:t>
-      </w:r>
-      <w:r>
-        <w:t xml:space="preserve">The </w:t>
-      </w:r>
-      <w:del w:id="125" w:author="서상협" w:date="2022-11-28T17:58:00Z">
-        <w:r>
-          <w:delText xml:space="preserve">reason that I research about </w:delText>
-        </w:r>
-      </w:del>
-      <w:r>
-        <w:t>a</w:t>
-      </w:r>
-      <w:r>
-        <w:t xml:space="preserve">cceleration </w:t>
-      </w:r>
-      <w:r>
-        <w:t>techniques</w:t>
-      </w:r>
-      <w:r>
-        <w:t xml:space="preserve"> </w:t>
-      </w:r>
-      <w:r>
-        <w:t xml:space="preserve">for iterative methods </w:t>
-      </w:r>
-      <w:del w:id="126" w:author="서상협" w:date="2022-11-28T17:59:00Z">
-        <w:r>
-          <w:delText xml:space="preserve">also </w:delText>
-        </w:r>
-      </w:del>
-      <w:r>
-        <w:t>are which save</w:t>
-      </w:r>
-      <w:r>
-        <w:t xml:space="preserve"> resources like electric power or time. </w:t>
-      </w:r>
-      <w:ins w:id="127" w:author="서상협" w:date="2022-11-28T18:03:00Z">
-        <w:r>
-          <w:t xml:space="preserve">As another technique, </w:t>
-        </w:r>
-      </w:ins>
-      <w:ins w:id="128" w:author="서상협" w:date="2022-11-28T18:04:00Z">
-        <w:r>
-          <w:t xml:space="preserve">I consider developing a new neural network model </w:t>
-        </w:r>
-      </w:ins>
-      <w:ins w:id="129" w:author="서상협" w:date="2022-11-28T18:05:00Z">
-        <w:r>
-          <w:t xml:space="preserve">to </w:t>
-        </w:r>
-      </w:ins>
-      <w:ins w:id="130" w:author="서상협" w:date="2022-11-28T18:06:00Z">
-        <w:r>
-          <w:t xml:space="preserve">discover </w:t>
-        </w:r>
-      </w:ins>
-      <w:ins w:id="131" w:author="서상협" w:date="2022-11-28T18:05:00Z">
-        <w:r>
-          <w:t xml:space="preserve">an efficient </w:t>
-        </w:r>
-      </w:ins>
-      <w:ins w:id="132" w:author="서상협" w:date="2022-11-28T18:06:00Z">
-        <w:r>
-          <w:t xml:space="preserve">technique finding solutions. In fact, some </w:t>
-        </w:r>
-      </w:ins>
-      <w:ins w:id="133" w:author="서상협" w:date="2022-11-28T18:08:00Z">
-        <w:r>
-          <w:t>researchers</w:t>
-        </w:r>
-      </w:ins>
-      <w:ins w:id="134" w:author="서상협" w:date="2022-11-28T18:06:00Z">
-        <w:r>
-          <w:t xml:space="preserve"> of </w:t>
-        </w:r>
-      </w:ins>
-      <w:ins w:id="135" w:author="서상협" w:date="2022-11-28T18:08:00Z">
-        <w:r>
-          <w:t xml:space="preserve">DeepMind published </w:t>
-        </w:r>
-      </w:ins>
-      <w:ins w:id="136" w:author="서상협" w:date="2022-11-28T18:09:00Z">
-        <w:r>
-          <w:t>an article “</w:t>
-        </w:r>
-        <w:r>
-          <w:rPr>
-            <w:rFonts w:hint="eastAsia"/>
-          </w:rPr>
-          <w:t>D</w:t>
-        </w:r>
-        <w:r>
-          <w:t>iscovering faster matrix multiplication algorithms with reinforcement learning</w:t>
-        </w:r>
-      </w:ins>
-      <w:ins w:id="137" w:author="서상협" w:date="2022-11-28T18:20:00Z">
-        <w:r>
-          <w:t>.</w:t>
-        </w:r>
-      </w:ins>
-      <w:ins w:id="138" w:author="서상협" w:date="2022-11-28T18:09:00Z">
-        <w:r>
-          <w:t>”</w:t>
-        </w:r>
-      </w:ins>
-      <w:ins w:id="139" w:author="서상협" w:date="2022-11-28T18:20:00Z">
-        <w:r>
-          <w:t xml:space="preserve"> </w:t>
-        </w:r>
-      </w:ins>
-      <w:ins w:id="140" w:author="서상협" w:date="2022-11-28T18:21:00Z">
-        <w:r>
-          <w:t xml:space="preserve">So, </w:t>
-        </w:r>
-      </w:ins>
-      <w:ins w:id="141" w:author="서상협" w:date="2022-11-28T18:13:00Z">
-        <w:r>
-          <w:t xml:space="preserve">I </w:t>
-        </w:r>
-      </w:ins>
-      <w:ins w:id="142" w:author="서상협" w:date="2022-11-28T18:21:00Z">
-        <w:r>
-          <w:t>will</w:t>
-        </w:r>
-      </w:ins>
-      <w:ins w:id="143" w:author="서상협" w:date="2022-11-28T18:13:00Z">
-        <w:r>
-          <w:t xml:space="preserve"> </w:t>
-        </w:r>
-      </w:ins>
-      <w:ins w:id="144" w:author="서상협" w:date="2022-11-28T18:19:00Z">
-        <w:r>
-          <w:t xml:space="preserve">develop a new model </w:t>
-        </w:r>
-      </w:ins>
-      <w:ins w:id="145" w:author="서상협" w:date="2022-11-28T18:13:00Z">
-        <w:r>
-          <w:t>discover</w:t>
-        </w:r>
-      </w:ins>
-      <w:ins w:id="146" w:author="서상협" w:date="2022-11-28T18:19:00Z">
-        <w:r>
-          <w:t>ing</w:t>
-        </w:r>
-      </w:ins>
-      <w:ins w:id="147" w:author="서상협" w:date="2022-11-28T18:13:00Z">
-        <w:r>
-          <w:t xml:space="preserve"> acceleration techniques </w:t>
-        </w:r>
-      </w:ins>
-      <w:ins w:id="148" w:author="서상협" w:date="2022-11-28T18:16:00Z">
-        <w:r>
-          <w:t xml:space="preserve">with my background </w:t>
-        </w:r>
-      </w:ins>
-      <w:ins w:id="149" w:author="서상협" w:date="2022-11-28T18:17:00Z">
-        <w:r>
-          <w:t xml:space="preserve">of </w:t>
-        </w:r>
-      </w:ins>
-      <w:ins w:id="150" w:author="서상협" w:date="2022-11-28T18:18:00Z">
-        <w:r>
-          <w:t xml:space="preserve">solving nonlinear matrix equations and </w:t>
-        </w:r>
-      </w:ins>
-      <w:ins w:id="151" w:author="서상협" w:date="2022-11-28T18:19:00Z">
-        <w:r>
-          <w:t xml:space="preserve">the paper. </w:t>
-        </w:r>
-      </w:ins>
-      <w:del w:id="152" w:author="서상협" w:date="2022-11-28T17:59:00Z">
-        <w:r>
-          <w:delText>To overcome heavy resource problems</w:delText>
-        </w:r>
-        <w:r>
-          <w:delText xml:space="preserve"> with other techniques</w:delText>
-        </w:r>
-        <w:r>
-          <w:delText xml:space="preserve">, I consider </w:delText>
-        </w:r>
-        <w:r>
-          <w:delText xml:space="preserve">applying efficient neural network model to finding solutions. Of course, neural network models also have heavy resource </w:delText>
-        </w:r>
-        <w:r>
-          <w:lastRenderedPageBreak/>
-          <w:delText xml:space="preserve">problems. </w:delText>
-        </w:r>
-        <w:r>
-          <w:delText>But, most heavy resources are needed when models are been in training process, and there are and will be many researches about increasing efficiency of neural models.</w:delText>
-        </w:r>
-      </w:del>
+      <w:pPr>
+        <w:rPr>
+          <w:rFonts w:hint="eastAsia"/>
+        </w:rPr>
+      </w:pPr>
+      <w:r>
+        <w:t>As a final goal, I hope to find solutions of various nonlinear matrix equations with neural network models. To find solutions of nonlinear matrix equations with iterative methods, we need a lot of computing resources. The acceleration techniques for iterative methods save resources such as electric power or time. On that account, I am going to develop a novel neural network model aiming to discover an efficient technique to find solutions. In fact, some researchers of DeepMind published an article entitled “</w:t>
+      </w:r>
+      <w:r>
+        <w:rPr>
+          <w:rFonts w:hint="eastAsia"/>
+        </w:rPr>
+        <w:t>D</w:t>
+      </w:r>
+      <w:r>
+        <w:t>iscovering faster matrix multiplication algorithms with reinforcement learning.” With my background of solving nonlinear matrix equations, I believe I can develop a new model to advance acceleration techniques.</w:t>
+      </w:r>
     </w:p>
     <w:sectPr>
       <w:pgSz w:w="11906" w:h="16838"/>
@@ -1723,10 +1197,66 @@
 </w:document>
 </file>
 
+<file path=word/endnotes.xml><?xml version="1.0" encoding="utf-8"?>
+<w:endnotes xmlns:wpc="http://schemas.microsoft.com/office/word/2010/wordprocessingCanvas" xmlns:cx="http://schemas.microsoft.com/office/drawing/2014/chartex" xmlns:cx1="http://schemas.microsoft.com/office/drawing/2015/9/8/chartex" xmlns:cx2="http://schemas.microsoft.com/office/drawing/2015/10/21/chartex" xmlns:cx3="http://schemas.microsoft.com/office/drawing/2016/5/9/chartex" xmlns:cx4="http://schemas.microsoft.com/office/drawing/2016/5/10/chartex" xmlns:cx5="http://schemas.microsoft.com/office/drawing/2016/5/11/chartex" xmlns:cx6="http://schemas.microsoft.com/office/drawing/2016/5/12/chartex" xmlns:cx7="http://schemas.microsoft.com/office/drawing/2016/5/13/chartex" xmlns:cx8="http://schemas.microsoft.com/office/drawing/2016/5/14/chartex" xmlns:mc="http://schemas.openxmlformats.org/markup-compatibility/2006" xmlns:aink="http://schemas.microsoft.com/office/drawing/2016/ink" xmlns:am3d="http://schemas.microsoft.com/office/drawing/2017/model3d" xmlns:o="urn:schemas-microsoft-com:office:office" xmlns:oel="http://schemas.microsoft.com/office/2019/extlst" xmlns:r="http://schemas.openxmlformats.org/officeDocument/2006/relationships" xmlns:m="http://schemas.openxmlformats.org/officeDocument/2006/math" xmlns:v="urn:schemas-microsoft-com:vml" xmlns:wp14="http://schemas.microsoft.com/office/word/2010/wordprocessingDrawing" xmlns:wp="http://schemas.openxmlformats.org/drawingml/2006/wordprocessingDrawing" xmlns:w10="urn:schemas-microsoft-com:office:word" xmlns:w="http://schemas.openxmlformats.org/wordprocessingml/2006/main" xmlns:w14="http://schemas.microsoft.com/office/word/2010/wordml" xmlns:w15="http://schemas.microsoft.com/office/word/2012/wordml" xmlns:w16cex="http://schemas.microsoft.com/office/word/2018/wordml/cex" xmlns:w16cid="http://schemas.microsoft.com/office/word/2016/wordml/cid" xmlns:w16="http://schemas.microsoft.com/office/word/2018/wordml" xmlns:w16sdtdh="http://schemas.microsoft.com/office/word/2020/wordml/sdtdatahash" xmlns:w16se="http://schemas.microsoft.com/office/word/2015/wordml/symex" xmlns:wpg="http://schemas.microsoft.com/office/word/2010/wordprocessingGroup" xmlns:wpi="http://schemas.microsoft.com/office/word/2010/wordprocessingInk" xmlns:wne="http://schemas.microsoft.com/office/word/2006/wordml" xmlns:wps="http://schemas.microsoft.com/office/word/2010/wordprocessingShape" mc:Ignorable="w14 w15 w16se w16cid w16 w16cex w16sdtdh wp14">
+  <w:endnote w:type="separator" w:id="-1">
+    <w:p>
+      <w:pPr>
+        <w:spacing w:after="0" w:line="240" w:lineRule="auto"/>
+      </w:pPr>
+      <w:r>
+        <w:separator/>
+      </w:r>
+    </w:p>
+  </w:endnote>
+  <w:endnote w:type="continuationSeparator" w:id="0">
+    <w:p>
+      <w:pPr>
+        <w:spacing w:after="0" w:line="240" w:lineRule="auto"/>
+      </w:pPr>
+      <w:r>
+        <w:continuationSeparator/>
+      </w:r>
+    </w:p>
+  </w:endnote>
+</w:endnotes>
+</file>
+
+<file path=word/footnotes.xml><?xml version="1.0" encoding="utf-8"?>
+<w:footnotes xmlns:wpc="http://schemas.microsoft.com/office/word/2010/wordprocessingCanvas" xmlns:cx="http://schemas.microsoft.com/office/drawing/2014/chartex" xmlns:cx1="http://schemas.microsoft.com/office/drawing/2015/9/8/chartex" xmlns:cx2="http://schemas.microsoft.com/office/drawing/2015/10/21/chartex" xmlns:cx3="http://schemas.microsoft.com/office/drawing/2016/5/9/chartex" xmlns:cx4="http://schemas.microsoft.com/office/drawing/2016/5/10/chartex" xmlns:cx5="http://schemas.microsoft.com/office/drawing/2016/5/11/chartex" xmlns:cx6="http://schemas.microsoft.com/office/drawing/2016/5/12/chartex" xmlns:cx7="http://schemas.microsoft.com/office/drawing/2016/5/13/chartex" xmlns:cx8="http://schemas.microsoft.com/office/drawing/2016/5/14/chartex" xmlns:mc="http://schemas.openxmlformats.org/markup-compatibility/2006" xmlns:aink="http://schemas.microsoft.com/office/drawing/2016/ink" xmlns:am3d="http://schemas.microsoft.com/office/drawing/2017/model3d" xmlns:o="urn:schemas-microsoft-com:office:office" xmlns:oel="http://schemas.microsoft.com/office/2019/extlst" xmlns:r="http://schemas.openxmlformats.org/officeDocument/2006/relationships" xmlns:m="http://schemas.openxmlformats.org/officeDocument/2006/math" xmlns:v="urn:schemas-microsoft-com:vml" xmlns:wp14="http://schemas.microsoft.com/office/word/2010/wordprocessingDrawing" xmlns:wp="http://schemas.openxmlformats.org/drawingml/2006/wordprocessingDrawing" xmlns:w10="urn:schemas-microsoft-com:office:word" xmlns:w="http://schemas.openxmlformats.org/wordprocessingml/2006/main" xmlns:w14="http://schemas.microsoft.com/office/word/2010/wordml" xmlns:w15="http://schemas.microsoft.com/office/word/2012/wordml" xmlns:w16cex="http://schemas.microsoft.com/office/word/2018/wordml/cex" xmlns:w16cid="http://schemas.microsoft.com/office/word/2016/wordml/cid" xmlns:w16="http://schemas.microsoft.com/office/word/2018/wordml" xmlns:w16sdtdh="http://schemas.microsoft.com/office/word/2020/wordml/sdtdatahash" xmlns:w16se="http://schemas.microsoft.com/office/word/2015/wordml/symex" xmlns:wpg="http://schemas.microsoft.com/office/word/2010/wordprocessingGroup" xmlns:wpi="http://schemas.microsoft.com/office/word/2010/wordprocessingInk" xmlns:wne="http://schemas.microsoft.com/office/word/2006/wordml" xmlns:wps="http://schemas.microsoft.com/office/word/2010/wordprocessingShape" mc:Ignorable="w14 w15 w16se w16cid w16 w16cex w16sdtdh wp14">
+  <w:footnote w:type="separator" w:id="-1">
+    <w:p>
+      <w:pPr>
+        <w:spacing w:after="0" w:line="240" w:lineRule="auto"/>
+      </w:pPr>
+      <w:r>
+        <w:separator/>
+      </w:r>
+    </w:p>
+  </w:footnote>
+  <w:footnote w:type="continuationSeparator" w:id="0">
+    <w:p>
+      <w:pPr>
+        <w:spacing w:after="0" w:line="240" w:lineRule="auto"/>
+      </w:pPr>
+      <w:r>
+        <w:continuationSeparator/>
+      </w:r>
+    </w:p>
+  </w:footnote>
+</w:footnotes>
+</file>
+
 <file path=word/people.xml><?xml version="1.0" encoding="utf-8"?>
 <w15:people xmlns:wpc="http://schemas.microsoft.com/office/word/2010/wordprocessingCanvas" xmlns:cx="http://schemas.microsoft.com/office/drawing/2014/chartex" xmlns:cx1="http://schemas.microsoft.com/office/drawing/2015/9/8/chartex" xmlns:cx2="http://schemas.microsoft.com/office/drawing/2015/10/21/chartex" xmlns:cx3="http://schemas.microsoft.com/office/drawing/2016/5/9/chartex" xmlns:cx4="http://schemas.microsoft.com/office/drawing/2016/5/10/chartex" xmlns:cx5="http://schemas.microsoft.com/office/drawing/2016/5/11/chartex" xmlns:cx6="http://schemas.microsoft.com/office/drawing/2016/5/12/chartex" xmlns:cx7="http://schemas.microsoft.com/office/drawing/2016/5/13/chartex" xmlns:cx8="http://schemas.microsoft.com/office/drawing/2016/5/14/chartex" xmlns:mc="http://schemas.openxmlformats.org/markup-compatibility/2006" xmlns:aink="http://schemas.microsoft.com/office/drawing/2016/ink" xmlns:am3d="http://schemas.microsoft.com/office/drawing/2017/model3d" xmlns:o="urn:schemas-microsoft-com:office:office" xmlns:oel="http://schemas.microsoft.com/office/2019/extlst" xmlns:r="http://schemas.openxmlformats.org/officeDocument/2006/relationships" xmlns:m="http://schemas.openxmlformats.org/officeDocument/2006/math" xmlns:v="urn:schemas-microsoft-com:vml" xmlns:wp14="http://schemas.microsoft.com/office/word/2010/wordprocessingDrawing" xmlns:wp="http://schemas.openxmlformats.org/drawingml/2006/wordprocessingDrawing" xmlns:w10="urn:schemas-microsoft-com:office:word" xmlns:w="http://schemas.openxmlformats.org/wordprocessingml/2006/main" xmlns:w14="http://schemas.microsoft.com/office/word/2010/wordml" xmlns:w15="http://schemas.microsoft.com/office/word/2012/wordml" xmlns:w16cex="http://schemas.microsoft.com/office/word/2018/wordml/cex" xmlns:w16cid="http://schemas.microsoft.com/office/word/2016/wordml/cid" xmlns:w16="http://schemas.microsoft.com/office/word/2018/wordml" xmlns:w16sdtdh="http://schemas.microsoft.com/office/word/2020/wordml/sdtdatahash" xmlns:w16se="http://schemas.microsoft.com/office/word/2015/wordml/symex" xmlns:wpg="http://schemas.microsoft.com/office/word/2010/wordprocessingGroup" xmlns:wpi="http://schemas.microsoft.com/office/word/2010/wordprocessingInk" xmlns:wne="http://schemas.microsoft.com/office/word/2006/wordml" xmlns:wps="http://schemas.microsoft.com/office/word/2010/wordprocessingShape" mc:Ignorable="w14 w15 w16se w16cid w16 w16cex w16sdtdh wp14">
+  <w15:person w15:author="Kyeongah Nah">
+    <w15:presenceInfo w15:providerId="None" w15:userId="Kyeongah Nah"/>
+  </w15:person>
   <w15:person w15:author="서상협">
     <w15:presenceInfo w15:providerId="None" w15:userId="서상협"/>
+  </w15:person>
+  <w15:person w15:author="상협 서">
+    <w15:presenceInfo w15:providerId="Windows Live" w15:userId="f0e370f664b0e5ab"/>
   </w15:person>
 </w15:people>
 </file>
@@ -2727,6 +2257,50 @@
       <w:spacing w:after="0" w:line="240" w:lineRule="auto"/>
     </w:pPr>
   </w:style>
+  <w:style w:type="paragraph" w:styleId="af1">
+    <w:name w:val="header"/>
+    <w:basedOn w:val="a"/>
+    <w:link w:val="Char3"/>
+    <w:uiPriority w:val="99"/>
+    <w:unhideWhenUsed/>
+    <w:rsid w:val="00DE358B"/>
+    <w:pPr>
+      <w:tabs>
+        <w:tab w:val="center" w:pos="4513"/>
+        <w:tab w:val="right" w:pos="9026"/>
+      </w:tabs>
+      <w:snapToGrid w:val="0"/>
+    </w:pPr>
+  </w:style>
+  <w:style w:type="character" w:customStyle="1" w:styleId="Char3">
+    <w:name w:val="머리글 Char"/>
+    <w:basedOn w:val="a0"/>
+    <w:link w:val="af1"/>
+    <w:uiPriority w:val="99"/>
+    <w:rsid w:val="00DE358B"/>
+  </w:style>
+  <w:style w:type="paragraph" w:styleId="af2">
+    <w:name w:val="footer"/>
+    <w:basedOn w:val="a"/>
+    <w:link w:val="Char4"/>
+    <w:uiPriority w:val="99"/>
+    <w:unhideWhenUsed/>
+    <w:rsid w:val="00DE358B"/>
+    <w:pPr>
+      <w:tabs>
+        <w:tab w:val="center" w:pos="4513"/>
+        <w:tab w:val="right" w:pos="9026"/>
+      </w:tabs>
+      <w:snapToGrid w:val="0"/>
+    </w:pPr>
+  </w:style>
+  <w:style w:type="character" w:customStyle="1" w:styleId="Char4">
+    <w:name w:val="바닥글 Char"/>
+    <w:basedOn w:val="a0"/>
+    <w:link w:val="af2"/>
+    <w:uiPriority w:val="99"/>
+    <w:rsid w:val="00DE358B"/>
+  </w:style>
 </w:styles>
 </file>
 

</xml_diff>